<commit_message>
Edit pass on SEC manuscript: wording, claims and table rendering
Co-Authored-By: Claude Opus 5.5 <noreply@anthropic.com>
Claude-Session: https://claude.ai/code/session_01EwYX7947LH3EDG8rbKyfAp
</commit_message>
<xml_diff>
--- a/research/submissions/SEC_2026-10-21/Young_Wikes_SEC_manuscript.docx
+++ b/research/submissions/SEC_2026-10-21/Young_Wikes_SEC_manuscript.docx
@@ -240,6 +240,7 @@
     <w:p>
       <w:pPr>
         <w:pStyle w:val="AbstractText"/>
+        <w:jc w:val="both"/>
       </w:pPr>
       <w:r>
         <w:rPr>
@@ -335,59 +336,69 @@
     <w:p>
       <w:pPr>
         <w:pStyle w:val="FirstParagraph"/>
-        <w:spacing w:line="276" w:lineRule="auto"/>
-      </w:pPr>
-      <w:r>
-        <w:rPr>
-          <w:rFonts w:ascii="Cambria" w:hAnsi="Cambria"/>
-          <w:sz w:val="20"/>
-        </w:rPr>
-        <w:t xml:space="preserve">A public-records determination is more than a response to a request. It is a record of administrative action, and it may later be examined by an appeals officer, an open-government body, a court, an auditor or a records professional asking whether the agency can account for what it did. By then the original decision-maker may have moved on, retired or forgotten the file. Whatever a later reviewer can learn about how the determination was reached must therefore come from the record itself.</w:t>
+        <w:spacing w:line="276" w:lineRule="auto" w:before="0" w:after="0"/>
+        <w:ind w:firstLine="283"/>
+        <w:jc w:val="both"/>
+      </w:pPr>
+      <w:r>
+        <w:rPr>
+          <w:rFonts w:ascii="Cambria" w:hAnsi="Cambria"/>
+          <w:sz w:val="20"/>
+        </w:rPr>
+        <w:t xml:space="preserve">A public-records determination responds to a request, but it is also a record of administrative action, and it may later be examined by an appeals officer, an open-government body, a court, an auditor or a records professional asking whether the agency can account for what it did. By then the original decision-maker may have moved on, retired or forgotten the file. Whatever a later reviewer can learn about how the determination was reached must therefore come from the record itself.</w:t>
       </w:r>
     </w:p>
     <w:p>
       <w:pPr>
         <w:pStyle w:val="BodyText"/>
-        <w:spacing w:line="276" w:lineRule="auto"/>
-      </w:pPr>
-      <w:r>
-        <w:rPr>
-          <w:rFonts w:ascii="Cambria" w:hAnsi="Cambria"/>
-          <w:sz w:val="20"/>
-        </w:rPr>
-        <w:t xml:space="preserve">That dependence has social and economic consequences that extend well beyond records offices. When the basis for a determination cannot be rebuilt from the record, the cost of finding out what happened is shifted onto someone else: onto the requester who must appeal, onto the appeals body or court that must reconstruct the decision from submissions, onto the auditor who must report that a programme cannot evidence its own conduct, and ultimately onto the public whose confidence in the institution depends on its ability to explain itself. Those costs are unevenly distributed. A well-resourced requester can litigate; an individual seeking records about their own case often cannot. An unreconstructable record is therefore not only a documentation weakness. It is a mechanism by which the burden of administrative opacity falls on the people least able to carry it.</w:t>
+        <w:spacing w:line="276" w:lineRule="auto" w:before="0" w:after="0"/>
+        <w:ind w:firstLine="283"/>
+        <w:jc w:val="both"/>
+      </w:pPr>
+      <w:r>
+        <w:rPr>
+          <w:rFonts w:ascii="Cambria" w:hAnsi="Cambria"/>
+          <w:sz w:val="20"/>
+        </w:rPr>
+        <w:t xml:space="preserve">That dependence has social and economic consequences that extend well beyond records offices. When the basis for a determination cannot be rebuilt from the record, the cost of finding out what happened is shifted onto someone else: onto the requester who must appeal, onto the appeals body or court that must reconstruct the decision from submissions, onto the auditor who must report that a programme cannot evidence its own conduct, and ultimately onto the public whose confidence in the institution depends on its ability to explain itself. Those costs are unevenly distributed. A well-resourced requester may be able to litigate; an individual seeking records about their own case may not. In this sense an unreconstructable record is also a channel through which the burden of administrative opacity can fall on those least able to bear it.</w:t>
       </w:r>
     </w:p>
     <w:p>
       <w:pPr>
         <w:pStyle w:val="BodyText"/>
-        <w:spacing w:line="276" w:lineRule="auto"/>
-      </w:pPr>
-      <w:r>
-        <w:rPr>
-          <w:rFonts w:ascii="Cambria" w:hAnsi="Cambria"/>
-          <w:sz w:val="20"/>
-        </w:rPr>
-        <w:t xml:space="preserve">The question is also timely. On 28 May 2026 the Chief FOIA Officers Council announced a government-wide effort to inventory freedom of information technology across United States federal agencies, covering case-management systems, electronic discovery platforms, document-review tools and their costs, so that the inventory can inform acquisition and implementation decisions (Chief FOIA Officers Council, 2026). An inventory of that kind answers what software agencies run. It does not answer whether the determinations produced with that software hold up when read cold by someone who was not involved. As automated and AI-assisted tools take on more of the drafting of administrative records, the risk grows that agencies will produce determinations that are fluent, formally complete and yet impossible to reconstruct. Two agencies can run the same case-management system and produce determinations of very different defensibility.</w:t>
+        <w:spacing w:line="276" w:lineRule="auto" w:before="0" w:after="0"/>
+        <w:ind w:firstLine="283"/>
+        <w:jc w:val="both"/>
+      </w:pPr>
+      <w:r>
+        <w:rPr>
+          <w:rFonts w:ascii="Cambria" w:hAnsi="Cambria"/>
+          <w:sz w:val="20"/>
+        </w:rPr>
+        <w:t xml:space="preserve">The question is also timely. On 28 May 2026 the Chief FOIA Officers Council announced a government-wide effort to inventory freedom of information technology across United States federal agencies, covering case-management systems, electronic discovery platforms, document-review tools and their costs, so that the inventory can inform acquisition and implementation decisions (Chief FOIA Officers Council, 2026). An inventory of that kind answers what software agencies run. It does not answer whether the determinations produced with that software can be understood by a reviewer who was not involved. As automated and AI-assisted tools take on more of the drafting of administrative records, the risk grows that agencies will produce determinations that are well written and formally complete yet impossible to reconstruct. Agencies using the same case-management system may still produce determinations that differ considerably in this respect.</w:t>
       </w:r>
     </w:p>
     <w:p>
       <w:pPr>
         <w:pStyle w:val="BodyText"/>
-        <w:spacing w:line="276" w:lineRule="auto"/>
-      </w:pPr>
-      <w:r>
-        <w:rPr>
-          <w:rFonts w:ascii="Cambria" w:hAnsi="Cambria"/>
-          <w:sz w:val="20"/>
-        </w:rPr>
-        <w:t xml:space="preserve">A determination can be facially complete and professionally written and still fail in this way, because the specific basis for each withholding is not on the page. The exemption relied on, the records located and produced, and the reasoning connecting them may simply be absent. That is not a technology problem in the ordinary sense. It is a documentation-quality problem, and it decides whether an agency can show what it did when someone asks.</w:t>
+        <w:spacing w:line="276" w:lineRule="auto" w:before="0" w:after="0"/>
+        <w:ind w:firstLine="283"/>
+        <w:jc w:val="both"/>
+      </w:pPr>
+      <w:r>
+        <w:rPr>
+          <w:rFonts w:ascii="Cambria" w:hAnsi="Cambria"/>
+          <w:sz w:val="20"/>
+        </w:rPr>
+        <w:t xml:space="preserve">A determination can be facially complete and professionally written and still fail in this way, because the specific basis for each withholding is not on the page. The exemption relied on, the records located and produced, and the reasoning connecting them may simply be absent. This is primarily a documentation-quality problem rather than a technological one, and it determines whether an agency can show what it did when asked.</w:t>
       </w:r>
     </w:p>
     <w:p>
       <w:pPr>
         <w:pStyle w:val="BodyText"/>
-        <w:spacing w:line="276" w:lineRule="auto"/>
+        <w:spacing w:line="276" w:lineRule="auto" w:before="0" w:after="0"/>
+        <w:ind w:firstLine="283"/>
+        <w:jc w:val="both"/>
       </w:pPr>
       <w:r>
         <w:rPr>
@@ -399,66 +410,62 @@
     </w:p>
     <w:p>
       <w:pPr>
-        <w:numPr>
-          <w:ilvl w:val="0"/>
-          <w:numId w:val="1001"/>
-        </w:numPr>
-        <w:pStyle w:val="Compact"/>
-        <w:spacing w:line="276" w:lineRule="auto"/>
-      </w:pPr>
-      <w:r>
-        <w:rPr>
-          <w:rFonts w:ascii="Cambria" w:hAnsi="Cambria"/>
-          <w:sz w:val="20"/>
-        </w:rPr>
-        <w:t xml:space="preserve">Can the review conditions be applied to real public-records material across document classes and jurisdictions, and do they produce a full range of reads?</w:t>
-      </w:r>
-    </w:p>
-    <w:p>
-      <w:pPr>
-        <w:numPr>
-          <w:ilvl w:val="0"/>
-          <w:numId w:val="1001"/>
-        </w:numPr>
-        <w:pStyle w:val="Compact"/>
-        <w:spacing w:line="276" w:lineRule="auto"/>
-      </w:pPr>
-      <w:r>
-        <w:rPr>
-          <w:rFonts w:ascii="Cambria" w:hAnsi="Cambria"/>
-          <w:sz w:val="20"/>
-        </w:rPr>
-        <w:t xml:space="preserve">Where an independent government auditor has assessed the sufficiency of the same records, does the read agree?</w:t>
-      </w:r>
-    </w:p>
-    <w:p>
-      <w:pPr>
-        <w:numPr>
-          <w:ilvl w:val="0"/>
-          <w:numId w:val="1001"/>
-        </w:numPr>
-        <w:pStyle w:val="Compact"/>
-        <w:spacing w:line="276" w:lineRule="auto"/>
-      </w:pPr>
-      <w:r>
-        <w:rPr>
-          <w:rFonts w:ascii="Cambria" w:hAnsi="Cambria"/>
-          <w:sz w:val="20"/>
-        </w:rPr>
-        <w:t xml:space="preserve">What drives the read, and is it the property the instrument claims to measure?</w:t>
-      </w:r>
-    </w:p>
-    <w:p>
-      <w:pPr>
-        <w:pStyle w:val="FirstParagraph"/>
-        <w:spacing w:line="276" w:lineRule="auto"/>
-      </w:pPr>
-      <w:r>
-        <w:rPr>
-          <w:rFonts w:ascii="Cambria" w:hAnsi="Cambria"/>
-          <w:sz w:val="20"/>
-        </w:rPr>
-        <w:t xml:space="preserve">The contribution is deliberately narrow. The study does not claim that the review improves administrative outcomes or that its results generalise beyond the material sampled. It provides initial evidence that reconstructability can be examined systematically at the level of an individual consequential record, and it sets out why that property matters for the economics of accountability and public trust.</w:t>
+        <w:pStyle w:val="BodyText"/>
+        <w:spacing w:line="276" w:lineRule="auto" w:before="0" w:after="0"/>
+        <w:ind w:left="283"/>
+        <w:jc w:val="both"/>
+      </w:pPr>
+      <w:r>
+        <w:rPr>
+          <w:rFonts w:ascii="Cambria" w:hAnsi="Cambria"/>
+          <w:sz w:val="20"/>
+        </w:rPr>
+        <w:t xml:space="preserve">1. Can the review conditions be applied to real public-records material across document classes and jurisdictions, and do they produce a full range of reads?</w:t>
+      </w:r>
+    </w:p>
+    <w:p>
+      <w:pPr>
+        <w:pStyle w:val="BodyText"/>
+        <w:spacing w:line="276" w:lineRule="auto" w:before="0" w:after="0"/>
+        <w:ind w:left="283"/>
+        <w:jc w:val="both"/>
+      </w:pPr>
+      <w:r>
+        <w:rPr>
+          <w:rFonts w:ascii="Cambria" w:hAnsi="Cambria"/>
+          <w:sz w:val="20"/>
+        </w:rPr>
+        <w:t xml:space="preserve">2. Where an independent government auditor has assessed the sufficiency of the same records, does the read agree?</w:t>
+      </w:r>
+    </w:p>
+    <w:p>
+      <w:pPr>
+        <w:pStyle w:val="BodyText"/>
+        <w:spacing w:line="276" w:lineRule="auto" w:before="0" w:after="0"/>
+        <w:ind w:left="283"/>
+        <w:jc w:val="both"/>
+      </w:pPr>
+      <w:r>
+        <w:rPr>
+          <w:rFonts w:ascii="Cambria" w:hAnsi="Cambria"/>
+          <w:sz w:val="20"/>
+        </w:rPr>
+        <w:t xml:space="preserve">3. What drives the read, and is it the property the instrument claims to measure?</w:t>
+      </w:r>
+    </w:p>
+    <w:p>
+      <w:pPr>
+        <w:pStyle w:val="BodyText"/>
+        <w:spacing w:line="276" w:lineRule="auto" w:before="0" w:after="0"/>
+        <w:ind w:firstLine="283"/>
+        <w:jc w:val="both"/>
+      </w:pPr>
+      <w:r>
+        <w:rPr>
+          <w:rFonts w:ascii="Cambria" w:hAnsi="Cambria"/>
+          <w:sz w:val="20"/>
+        </w:rPr>
+        <w:t xml:space="preserve">The scope of the contribution is limited. The study does not claim that the review improves administrative outcomes or that its results generalise beyond the material sampled. It provides initial evidence that reconstructability can be examined systematically at the level of an individual consequential record, and it sets out why that property matters for the economics of accountability and public trust.</w:t>
       </w:r>
     </w:p>
     <w:bookmarkEnd w:id="20"/>
@@ -483,7 +490,9 @@
     <w:p>
       <w:pPr>
         <w:pStyle w:val="FirstParagraph"/>
-        <w:spacing w:line="276" w:lineRule="auto"/>
+        <w:spacing w:line="276" w:lineRule="auto" w:before="0" w:after="0"/>
+        <w:ind w:firstLine="283"/>
+        <w:jc w:val="both"/>
       </w:pPr>
       <w:r>
         <w:rPr>
@@ -496,14 +505,16 @@
     <w:p>
       <w:pPr>
         <w:pStyle w:val="BodyText"/>
-        <w:spacing w:line="276" w:lineRule="auto"/>
-      </w:pPr>
-      <w:r>
-        <w:rPr>
-          <w:rFonts w:ascii="Cambria" w:hAnsi="Cambria"/>
-          <w:sz w:val="20"/>
-        </w:rPr>
-        <w:t xml:space="preserve">Work on measuring record qualities exists. Makhlouf Shabou (2015) develops a model and instruments for defining and measuring quality dimensions of public electronic records, drawing on digital diplomatics. Farrell (2024) examines public sector recordkeeping against accountability understood both as a mechanism and as a virtue, finding gaps in the mechanisms through which public bodies can be required to explain their recordkeeping conduct. The present study is narrower than either. It asks whether one property, the reconstructability of the basis for an individual determination, can be assessed consistently from the record alone, and it tests that on public material where an independent assessment of the same programmes already exists.</w:t>
+        <w:spacing w:line="276" w:lineRule="auto" w:before="0" w:after="0"/>
+        <w:ind w:firstLine="283"/>
+        <w:jc w:val="both"/>
+      </w:pPr>
+      <w:r>
+        <w:rPr>
+          <w:rFonts w:ascii="Cambria" w:hAnsi="Cambria"/>
+          <w:sz w:val="20"/>
+        </w:rPr>
+        <w:t xml:space="preserve">Several studies have sought to measure record qualities. Makhlouf Shabou (2015) develops a model and instruments for defining and measuring quality dimensions of public electronic records, drawing on digital diplomatics. Farrell (2024) examines public sector recordkeeping against accountability understood both as a mechanism and as a virtue, finding gaps in the mechanisms through which public bodies can be required to explain their recordkeeping conduct. The present study is narrower than either. It asks whether one property, the reconstructability of the basis for an individual determination, can be assessed consistently from the record alone, and it tests that on public material where an independent assessment of the same programmes already exists.</w:t>
       </w:r>
     </w:p>
     <w:bookmarkEnd w:id="21"/>
@@ -519,7 +530,9 @@
     <w:p>
       <w:pPr>
         <w:pStyle w:val="FirstParagraph"/>
-        <w:spacing w:line="276" w:lineRule="auto"/>
+        <w:spacing w:line="276" w:lineRule="auto" w:before="0" w:after="0"/>
+        <w:ind w:firstLine="283"/>
+        <w:jc w:val="both"/>
       </w:pPr>
       <w:r>
         <w:rPr>
@@ -532,7 +545,9 @@
     <w:p>
       <w:pPr>
         <w:pStyle w:val="BodyText"/>
-        <w:spacing w:line="276" w:lineRule="auto"/>
+        <w:spacing w:line="276" w:lineRule="auto" w:before="0" w:after="0"/>
+        <w:ind w:firstLine="283"/>
+        <w:jc w:val="both"/>
       </w:pPr>
       <w:r>
         <w:rPr>
@@ -545,7 +560,9 @@
     <w:p>
       <w:pPr>
         <w:pStyle w:val="BodyText"/>
-        <w:spacing w:line="276" w:lineRule="auto"/>
+        <w:spacing w:line="276" w:lineRule="auto" w:before="0" w:after="0"/>
+        <w:ind w:firstLine="283"/>
+        <w:jc w:val="both"/>
       </w:pPr>
       <w:r>
         <w:rPr>
@@ -568,20 +585,24 @@
     <w:p>
       <w:pPr>
         <w:pStyle w:val="FirstParagraph"/>
-        <w:spacing w:line="276" w:lineRule="auto"/>
-      </w:pPr>
-      <w:r>
-        <w:rPr>
-          <w:rFonts w:ascii="Cambria" w:hAnsi="Cambria"/>
-          <w:sz w:val="20"/>
-        </w:rPr>
-        <w:t xml:space="preserve">Administrative justice scholarship adds a procedural dimension. Mashaw (1983) argues that the legitimacy of mass administrative decision-making rests on its capacity to produce accurate, reasoned and reviewable decisions at scale. Tyler (2006) shows that people’s willingness to accept decisions, including adverse ones, depends substantially on whether they perceive the process as fair, and perceived fairness depends in turn on whether the reasons for a decision are visible. A record that does not preserve its own reasoning undermines both the reviewability Mashaw identifies and the procedural legitimacy Tyler describes.</w:t>
+        <w:spacing w:line="276" w:lineRule="auto" w:before="0" w:after="0"/>
+        <w:ind w:firstLine="283"/>
+        <w:jc w:val="both"/>
+      </w:pPr>
+      <w:r>
+        <w:rPr>
+          <w:rFonts w:ascii="Cambria" w:hAnsi="Cambria"/>
+          <w:sz w:val="20"/>
+        </w:rPr>
+        <w:t xml:space="preserve">Administrative justice scholarship adds a procedural dimension. Mashaw (1983) argues that mass administrative adjudication should be judged by its capacity to reach accurate decisions consistently and to justify them. Tyler (2006) shows that people’s willingness to accept decisions, including adverse ones, depends substantially on whether they perceive the process as fair, and the quality of decision-making, including whether decisions are explained, is one element of that perception. A record that does not preserve its own reasoning weakens both the justification Mashaw emphasises and the procedural legitimacy Tyler describes.</w:t>
       </w:r>
     </w:p>
     <w:p>
       <w:pPr>
         <w:pStyle w:val="BodyText"/>
-        <w:spacing w:line="276" w:lineRule="auto"/>
+        <w:spacing w:line="276" w:lineRule="auto" w:before="0" w:after="0"/>
+        <w:ind w:firstLine="283"/>
+        <w:jc w:val="both"/>
       </w:pPr>
       <w:r>
         <w:rPr>
@@ -604,7 +625,9 @@
     <w:p>
       <w:pPr>
         <w:pStyle w:val="FirstParagraph"/>
-        <w:spacing w:line="276" w:lineRule="auto"/>
+        <w:spacing w:line="276" w:lineRule="auto" w:before="0" w:after="0"/>
+        <w:ind w:firstLine="283"/>
+        <w:jc w:val="both"/>
       </w:pPr>
       <w:r>
         <w:rPr>
@@ -637,20 +660,24 @@
     <w:p>
       <w:pPr>
         <w:pStyle w:val="FirstParagraph"/>
-        <w:spacing w:line="276" w:lineRule="auto"/>
-      </w:pPr>
-      <w:r>
-        <w:rPr>
-          <w:rFonts w:ascii="Cambria" w:hAnsi="Cambria"/>
-          <w:sz w:val="20"/>
-        </w:rPr>
-        <w:t xml:space="preserve">The study applies a structured record-level review protocol designed to examine whether the basis of a consequential determination can later be reconstructed from the record itself. In this study the protocol is referred to as the Justification Review Standard. Five conditions carry the question. Reconstructability asks whether the conclusion can be rebuilt from the record alone. Basis identification asks whether the source of each characterisation is identifiable. Chronological integrity asks whether dates, sequence and sources hold together when read cold. Decision-process traceability asks whether the reasoning from evidence to conclusion can be followed and the responsible parties identified. Evidentiary sufficiency asks whether the record carries enough to support the weight of the decision.</w:t>
+        <w:spacing w:line="276" w:lineRule="auto" w:before="0" w:after="0"/>
+        <w:ind w:firstLine="283"/>
+        <w:jc w:val="both"/>
+      </w:pPr>
+      <w:r>
+        <w:rPr>
+          <w:rFonts w:ascii="Cambria" w:hAnsi="Cambria"/>
+          <w:sz w:val="20"/>
+        </w:rPr>
+        <w:t xml:space="preserve">The study applies a structured record-level review protocol designed to examine whether the basis of a consequential determination can later be reconstructed from the record itself. In this study the protocol is referred to as the Justification Review Standard. Five conditions carry the question. Reconstructability asks whether the conclusion can be rebuilt from the record alone. Basis identification asks whether the source of each characterisation is identifiable. Chronological integrity asks whether dates, sequence and sources are consistent when read by someone unfamiliar with the matter. Decision-process traceability asks whether the reasoning from evidence to conclusion can be followed and the responsible parties identified. Evidentiary sufficiency asks whether the record carries enough to support the weight of the decision.</w:t>
       </w:r>
     </w:p>
     <w:p>
       <w:pPr>
         <w:pStyle w:val="BodyText"/>
-        <w:spacing w:line="276" w:lineRule="auto"/>
+        <w:spacing w:line="276" w:lineRule="auto" w:before="0" w:after="0"/>
+        <w:ind w:firstLine="283"/>
+        <w:jc w:val="both"/>
       </w:pPr>
       <w:r>
         <w:rPr>
@@ -673,7 +700,9 @@
     <w:p>
       <w:pPr>
         <w:pStyle w:val="FirstParagraph"/>
-        <w:spacing w:line="276" w:lineRule="auto"/>
+        <w:spacing w:line="276" w:lineRule="auto" w:before="0" w:after="0"/>
+        <w:ind w:firstLine="283"/>
+        <w:jc w:val="both"/>
       </w:pPr>
       <w:r>
         <w:rPr>
@@ -696,7 +725,9 @@
     <w:p>
       <w:pPr>
         <w:pStyle w:val="FirstParagraph"/>
-        <w:spacing w:line="276" w:lineRule="auto"/>
+        <w:spacing w:line="276" w:lineRule="auto" w:before="0" w:after="0"/>
+        <w:ind w:firstLine="283"/>
+        <w:jc w:val="both"/>
       </w:pPr>
       <w:r>
         <w:rPr>
@@ -719,7 +750,9 @@
     <w:p>
       <w:pPr>
         <w:pStyle w:val="FirstParagraph"/>
-        <w:spacing w:line="276" w:lineRule="auto"/>
+        <w:spacing w:line="276" w:lineRule="auto" w:before="0" w:after="0"/>
+        <w:ind w:firstLine="283"/>
+        <w:jc w:val="both"/>
       </w:pPr>
       <w:r>
         <w:rPr>
@@ -732,7 +765,9 @@
     <w:p>
       <w:pPr>
         <w:pStyle w:val="BodyText"/>
-        <w:spacing w:line="276" w:lineRule="auto"/>
+        <w:spacing w:line="276" w:lineRule="auto" w:before="0" w:after="0"/>
+        <w:ind w:firstLine="283"/>
+        <w:jc w:val="both"/>
       </w:pPr>
       <w:r>
         <w:rPr>
@@ -755,7 +790,9 @@
     <w:p>
       <w:pPr>
         <w:pStyle w:val="FirstParagraph"/>
-        <w:spacing w:line="276" w:lineRule="auto"/>
+        <w:spacing w:line="276" w:lineRule="auto" w:before="0" w:after="0"/>
+        <w:ind w:firstLine="283"/>
+        <w:jc w:val="both"/>
       </w:pPr>
       <w:r>
         <w:rPr>
@@ -778,7 +815,9 @@
     <w:p>
       <w:pPr>
         <w:pStyle w:val="FirstParagraph"/>
-        <w:spacing w:line="276" w:lineRule="auto"/>
+        <w:spacing w:line="276" w:lineRule="auto" w:before="0" w:after="0"/>
+        <w:ind w:firstLine="283"/>
+        <w:jc w:val="both"/>
       </w:pPr>
       <w:r>
         <w:rPr>
@@ -791,7 +830,9 @@
     <w:p>
       <w:pPr>
         <w:pStyle w:val="BodyText"/>
-        <w:spacing w:line="276" w:lineRule="auto"/>
+        <w:spacing w:line="276" w:lineRule="auto" w:before="0" w:after="0"/>
+        <w:ind w:firstLine="283"/>
+        <w:jc w:val="both"/>
       </w:pPr>
       <w:r>
         <w:rPr>
@@ -804,7 +845,9 @@
     <w:p>
       <w:pPr>
         <w:pStyle w:val="BodyText"/>
-        <w:spacing w:line="276" w:lineRule="auto"/>
+        <w:spacing w:line="276" w:lineRule="auto" w:before="0" w:after="0"/>
+        <w:ind w:firstLine="283"/>
+        <w:jc w:val="both"/>
       </w:pPr>
       <w:r>
         <w:rPr>
@@ -817,7 +860,9 @@
     <w:p>
       <w:pPr>
         <w:pStyle w:val="BodyText"/>
-        <w:spacing w:line="276" w:lineRule="auto"/>
+        <w:spacing w:line="276" w:lineRule="auto" w:before="0" w:after="0"/>
+        <w:ind w:firstLine="283"/>
+        <w:jc w:val="both"/>
       </w:pPr>
       <w:r>
         <w:rPr>
@@ -830,7 +875,9 @@
     <w:p>
       <w:pPr>
         <w:pStyle w:val="BodyText"/>
-        <w:spacing w:line="276" w:lineRule="auto"/>
+        <w:spacing w:line="276" w:lineRule="auto" w:before="0" w:after="0"/>
+        <w:ind w:firstLine="283"/>
+        <w:jc w:val="both"/>
       </w:pPr>
       <w:r>
         <w:rPr>
@@ -843,7 +890,9 @@
     <w:p>
       <w:pPr>
         <w:pStyle w:val="BodyText"/>
-        <w:spacing w:line="276" w:lineRule="auto"/>
+        <w:spacing w:line="276" w:lineRule="auto" w:before="0" w:after="0"/>
+        <w:ind w:firstLine="283"/>
+        <w:jc w:val="both"/>
       </w:pPr>
       <w:r>
         <w:rPr>
@@ -866,20 +915,24 @@
     <w:p>
       <w:pPr>
         <w:pStyle w:val="FirstParagraph"/>
-        <w:spacing w:line="276" w:lineRule="auto"/>
-      </w:pPr>
-      <w:r>
-        <w:rPr>
-          <w:rFonts w:ascii="Cambria" w:hAnsi="Cambria"/>
-          <w:sz w:val="20"/>
-        </w:rPr>
-        <w:t xml:space="preserve">To estimate reader dependence, 10 of the 32 cases were re-read by an independent reviewer with no connection to the study and no prior familiarity with the instrument, who recorded a read and a short reason for each case. The 10 were drawn from the corpus stratified by the original read with a floor of one case per category, ordered by case identifier within each stratum and interleaved so that consecutive cases do not share a category. Six, three and one fell to Ready, Needs work and Gap respectively. No random number generator was used, so the selection is reproducible from the packet builder alone.</w:t>
+        <w:spacing w:line="276" w:lineRule="auto" w:before="0" w:after="0"/>
+        <w:ind w:firstLine="283"/>
+        <w:jc w:val="both"/>
+      </w:pPr>
+      <w:r>
+        <w:rPr>
+          <w:rFonts w:ascii="Cambria" w:hAnsi="Cambria"/>
+          <w:sz w:val="20"/>
+        </w:rPr>
+        <w:t xml:space="preserve">To estimate reader dependence, 10 of the 32 cases were re-read by an independent reviewer with no connection to the study and no prior familiarity with the instrument, who recorded a read and a short reason for each case. The 10 were drawn from the corpus stratified by the original read with a floor of one case per category, ordered by case identifier within each stratum and interleaved so that consecutive cases do not share a category. Six, three and one fell to Ready, Needs work and Gap respectively. No random number generator was used, so the selection can be reproduced from the case identifiers and the stated rule alone.</w:t>
       </w:r>
     </w:p>
     <w:p>
       <w:pPr>
         <w:pStyle w:val="BodyText"/>
-        <w:spacing w:line="276" w:lineRule="auto"/>
+        <w:spacing w:line="276" w:lineRule="auto" w:before="0" w:after="0"/>
+        <w:ind w:firstLine="283"/>
+        <w:jc w:val="both"/>
       </w:pPr>
       <w:r>
         <w:rPr>
@@ -912,7 +965,9 @@
     <w:p>
       <w:pPr>
         <w:pStyle w:val="FirstParagraph"/>
-        <w:spacing w:line="276" w:lineRule="auto"/>
+        <w:spacing w:line="276" w:lineRule="auto" w:before="0" w:after="0"/>
+        <w:ind w:firstLine="283"/>
+        <w:jc w:val="both"/>
       </w:pPr>
       <w:r>
         <w:rPr>
@@ -1001,7 +1056,9 @@
     <w:p>
       <w:pPr>
         <w:pStyle w:val="BodyText"/>
-        <w:spacing w:line="276" w:lineRule="auto"/>
+        <w:spacing w:line="276" w:lineRule="auto" w:before="0" w:after="0"/>
+        <w:ind w:firstLine="283"/>
+        <w:jc w:val="both"/>
       </w:pPr>
       <w:r>
         <w:rPr>
@@ -1100,7 +1157,9 @@
     <w:p>
       <w:pPr>
         <w:pStyle w:val="FirstParagraph"/>
-        <w:spacing w:line="276" w:lineRule="auto"/>
+        <w:spacing w:line="276" w:lineRule="auto" w:before="0" w:after="0"/>
+        <w:ind w:firstLine="283"/>
+        <w:jc w:val="both"/>
       </w:pPr>
       <w:r>
         <w:rPr>
@@ -1113,7 +1172,9 @@
     <w:p>
       <w:pPr>
         <w:pStyle w:val="BodyText"/>
-        <w:spacing w:line="276" w:lineRule="auto"/>
+        <w:spacing w:line="276" w:lineRule="auto" w:before="0" w:after="0"/>
+        <w:ind w:firstLine="283"/>
+        <w:jc w:val="both"/>
       </w:pPr>
       <w:r>
         <w:rPr>
@@ -1136,7 +1197,9 @@
     <w:p>
       <w:pPr>
         <w:pStyle w:val="FirstParagraph"/>
-        <w:spacing w:line="276" w:lineRule="auto"/>
+        <w:spacing w:line="276" w:lineRule="auto" w:before="0" w:after="0"/>
+        <w:ind w:firstLine="283"/>
+        <w:jc w:val="both"/>
       </w:pPr>
       <w:r>
         <w:rPr>
@@ -1162,22 +1225,25 @@
     <w:tbl>
       <w:tblPr>
         <w:tblStyle w:val="TableGrid"/>
-        <w:tblW w:type="auto" w:w="0"/>
+        <w:tblW w:type="pct" w:w="5000"/>
         <w:tblLook w:firstRow="1" w:lastRow="0" w:firstColumn="0" w:lastColumn="0" w:noHBand="0" w:noVBand="0" w:val="0020"/>
         <w:jc w:val="start"/>
+        <w:tblLayout w:type="fixed"/>
       </w:tblPr>
       <w:tblGrid>
-        <w:gridCol w:w="1980"/>
-        <w:gridCol w:w="1980"/>
-        <w:gridCol w:w="1980"/>
-        <w:gridCol w:w="1980"/>
+        <w:gridCol w:w="3764"/>
+        <w:gridCol w:w="1882"/>
+        <w:gridCol w:w="1882"/>
+        <w:gridCol w:w="1882"/>
       </w:tblGrid>
       <w:tr>
         <w:trPr>
           <w:tblHeader w:val="true"/>
         </w:trPr>
         <w:tc>
-          <w:tcPr/>
+          <w:tcPr>
+            <w:tcW w:type="dxa" w:w="3764"/>
+          </w:tcPr>
           <w:p>
             <w:pPr>
               <w:pStyle w:val="Compact"/>
@@ -1186,6 +1252,7 @@
             <w:r>
               <w:rPr>
                 <w:rFonts w:ascii="Cambria" w:hAnsi="Cambria"/>
+                <w:b/>
                 <w:sz w:val="18"/>
               </w:rPr>
               <w:t xml:space="preserve">Read</w:t>
@@ -1193,15 +1260,18 @@
           </w:p>
         </w:tc>
         <w:tc>
-          <w:tcPr/>
+          <w:tcPr>
+            <w:tcW w:type="dxa" w:w="1882"/>
+          </w:tcPr>
           <w:p>
             <w:pPr>
               <w:pStyle w:val="Compact"/>
-              <w:jc w:val="left"/>
+              <w:jc w:val="center"/>
             </w:pPr>
             <w:r>
               <w:rPr>
                 <w:rFonts w:ascii="Cambria" w:hAnsi="Cambria"/>
+                <w:b/>
                 <w:sz w:val="18"/>
               </w:rPr>
               <w:t xml:space="preserve">Failure stated (cases)</w:t>
@@ -1209,15 +1279,18 @@
           </w:p>
         </w:tc>
         <w:tc>
-          <w:tcPr/>
+          <w:tcPr>
+            <w:tcW w:type="dxa" w:w="1882"/>
+          </w:tcPr>
           <w:p>
             <w:pPr>
               <w:pStyle w:val="Compact"/>
-              <w:jc w:val="left"/>
+              <w:jc w:val="center"/>
             </w:pPr>
             <w:r>
               <w:rPr>
                 <w:rFonts w:ascii="Cambria" w:hAnsi="Cambria"/>
+                <w:b/>
                 <w:sz w:val="18"/>
               </w:rPr>
               <w:t xml:space="preserve">Not stated (cases)</w:t>
@@ -1225,15 +1298,18 @@
           </w:p>
         </w:tc>
         <w:tc>
-          <w:tcPr/>
+          <w:tcPr>
+            <w:tcW w:type="dxa" w:w="1882"/>
+          </w:tcPr>
           <w:p>
             <w:pPr>
               <w:pStyle w:val="Compact"/>
-              <w:jc w:val="left"/>
+              <w:jc w:val="center"/>
             </w:pPr>
             <w:r>
               <w:rPr>
                 <w:rFonts w:ascii="Cambria" w:hAnsi="Cambria"/>
+                <w:b/>
                 <w:sz w:val="18"/>
               </w:rPr>
               <w:t xml:space="preserve">Rate (%)</w:t>
@@ -1243,7 +1319,9 @@
       </w:tr>
       <w:tr>
         <w:tc>
-          <w:tcPr/>
+          <w:tcPr>
+            <w:tcW w:type="dxa" w:w="3764"/>
+          </w:tcPr>
           <w:p>
             <w:pPr>
               <w:pStyle w:val="Compact"/>
@@ -1259,11 +1337,13 @@
           </w:p>
         </w:tc>
         <w:tc>
-          <w:tcPr/>
+          <w:tcPr>
+            <w:tcW w:type="dxa" w:w="1882"/>
+          </w:tcPr>
           <w:p>
             <w:pPr>
               <w:pStyle w:val="Compact"/>
-              <w:jc w:val="left"/>
+              <w:jc w:val="center"/>
             </w:pPr>
             <w:r>
               <w:rPr>
@@ -1275,11 +1355,13 @@
           </w:p>
         </w:tc>
         <w:tc>
-          <w:tcPr/>
+          <w:tcPr>
+            <w:tcW w:type="dxa" w:w="1882"/>
+          </w:tcPr>
           <w:p>
             <w:pPr>
               <w:pStyle w:val="Compact"/>
-              <w:jc w:val="left"/>
+              <w:jc w:val="center"/>
             </w:pPr>
             <w:r>
               <w:rPr>
@@ -1291,11 +1373,13 @@
           </w:p>
         </w:tc>
         <w:tc>
-          <w:tcPr/>
+          <w:tcPr>
+            <w:tcW w:type="dxa" w:w="1882"/>
+          </w:tcPr>
           <w:p>
             <w:pPr>
               <w:pStyle w:val="Compact"/>
-              <w:jc w:val="left"/>
+              <w:jc w:val="center"/>
             </w:pPr>
             <w:r>
               <w:rPr>
@@ -1309,7 +1393,9 @@
       </w:tr>
       <w:tr>
         <w:tc>
-          <w:tcPr/>
+          <w:tcPr>
+            <w:tcW w:type="dxa" w:w="3764"/>
+          </w:tcPr>
           <w:p>
             <w:pPr>
               <w:pStyle w:val="Compact"/>
@@ -1325,11 +1411,13 @@
           </w:p>
         </w:tc>
         <w:tc>
-          <w:tcPr/>
+          <w:tcPr>
+            <w:tcW w:type="dxa" w:w="1882"/>
+          </w:tcPr>
           <w:p>
             <w:pPr>
               <w:pStyle w:val="Compact"/>
-              <w:jc w:val="left"/>
+              <w:jc w:val="center"/>
             </w:pPr>
             <w:r>
               <w:rPr>
@@ -1341,11 +1429,13 @@
           </w:p>
         </w:tc>
         <w:tc>
-          <w:tcPr/>
+          <w:tcPr>
+            <w:tcW w:type="dxa" w:w="1882"/>
+          </w:tcPr>
           <w:p>
             <w:pPr>
               <w:pStyle w:val="Compact"/>
-              <w:jc w:val="left"/>
+              <w:jc w:val="center"/>
             </w:pPr>
             <w:r>
               <w:rPr>
@@ -1357,11 +1447,13 @@
           </w:p>
         </w:tc>
         <w:tc>
-          <w:tcPr/>
+          <w:tcPr>
+            <w:tcW w:type="dxa" w:w="1882"/>
+          </w:tcPr>
           <w:p>
             <w:pPr>
               <w:pStyle w:val="Compact"/>
-              <w:jc w:val="left"/>
+              <w:jc w:val="center"/>
             </w:pPr>
             <w:r>
               <w:rPr>
@@ -1392,20 +1484,24 @@
     <w:p>
       <w:pPr>
         <w:pStyle w:val="BodyText"/>
-        <w:spacing w:line="276" w:lineRule="auto"/>
-      </w:pPr>
-      <w:r>
-        <w:rPr>
-          <w:rFonts w:ascii="Cambria" w:hAnsi="Cambria"/>
-          <w:sz w:val="20"/>
-        </w:rPr>
-        <w:t xml:space="preserve">The direction is uniform. In the Needs work cases the recorded reason is that the source reports the outcome without reproducing the material that would let a reader test it: a redacted contract and its technical schedules were not reproduced; 165,000 pages and their redaction universe were not available; the record-by-record exemption analysis was never before the court; a security assessment was reviewed in camera and never published. In the Ready cases the opposite is recorded, and eleven of the 17 notes say so directly: the opinion walks through the original request, the records access officer’s response, the appeal determination, the lower-court rulings and the holding; the appeal determination is quoted almost verbatim; the source identifies the record category, the exemption, the statutory change, the agency position and the conclusion. No Needs work note contains an affirmative reconstructability statement, and no Ready note contains a reconstructability failure.</w:t>
+        <w:spacing w:line="276" w:lineRule="auto" w:before="0" w:after="0"/>
+        <w:ind w:firstLine="283"/>
+        <w:jc w:val="both"/>
+      </w:pPr>
+      <w:r>
+        <w:rPr>
+          <w:rFonts w:ascii="Cambria" w:hAnsi="Cambria"/>
+          <w:sz w:val="20"/>
+        </w:rPr>
+        <w:t xml:space="preserve">In each Needs work case the recorded reason is that the source reports the outcome without reproducing the material that would let a reader test it: a redacted contract and its technical schedules were not reproduced; 165,000 pages and their redaction universe were not available; the record-by-record exemption analysis was never before the court; a security assessment was reviewed in camera and never published. In the Ready cases the opposite is recorded, and eleven of the 17 notes say so directly: the opinion walks through the original request, the records access officer’s response, the appeal determination, the lower-court rulings and the holding; the appeal determination is quoted almost verbatim; the source identifies the record category, the exemption, the statutory change, the agency position and the conclusion. No Needs work note contains an affirmative reconstructability statement, and no Ready note contains a reconstructability failure.</w:t>
       </w:r>
     </w:p>
     <w:p>
       <w:pPr>
         <w:pStyle w:val="BodyText"/>
-        <w:spacing w:line="276" w:lineRule="auto"/>
+        <w:spacing w:line="276" w:lineRule="auto" w:before="0" w:after="0"/>
+        <w:ind w:firstLine="283"/>
+        <w:jc w:val="both"/>
       </w:pPr>
       <w:r>
         <w:rPr>
@@ -1428,7 +1524,9 @@
     <w:p>
       <w:pPr>
         <w:pStyle w:val="FirstParagraph"/>
-        <w:spacing w:line="276" w:lineRule="auto"/>
+        <w:spacing w:line="276" w:lineRule="auto" w:before="0" w:after="0"/>
+        <w:ind w:firstLine="283"/>
+        <w:jc w:val="both"/>
       </w:pPr>
       <w:r>
         <w:rPr>
@@ -1517,7 +1615,9 @@
     <w:p>
       <w:pPr>
         <w:pStyle w:val="BodyText"/>
-        <w:spacing w:line="276" w:lineRule="auto"/>
+        <w:spacing w:line="276" w:lineRule="auto" w:before="0" w:after="0"/>
+        <w:ind w:firstLine="283"/>
+        <w:jc w:val="both"/>
       </w:pPr>
       <w:r>
         <w:rPr>
@@ -1543,21 +1643,24 @@
     <w:tbl>
       <w:tblPr>
         <w:tblStyle w:val="TableGrid"/>
-        <w:tblW w:type="auto" w:w="0"/>
+        <w:tblW w:type="pct" w:w="5000"/>
         <w:tblLook w:firstRow="1" w:lastRow="0" w:firstColumn="0" w:lastColumn="0" w:noHBand="0" w:noVBand="0" w:val="0020"/>
         <w:jc w:val="start"/>
+        <w:tblLayout w:type="fixed"/>
       </w:tblPr>
       <w:tblGrid>
-        <w:gridCol w:w="2640"/>
-        <w:gridCol w:w="2640"/>
-        <w:gridCol w:w="2640"/>
+        <w:gridCol w:w="3764"/>
+        <w:gridCol w:w="2823"/>
+        <w:gridCol w:w="2823"/>
       </w:tblGrid>
       <w:tr>
         <w:trPr>
           <w:tblHeader w:val="true"/>
         </w:trPr>
         <w:tc>
-          <w:tcPr/>
+          <w:tcPr>
+            <w:tcW w:type="dxa" w:w="3764"/>
+          </w:tcPr>
           <w:p>
             <w:pPr>
               <w:pStyle w:val="Compact"/>
@@ -1566,6 +1669,7 @@
             <w:r>
               <w:rPr>
                 <w:rFonts w:ascii="Cambria" w:hAnsi="Cambria"/>
+                <w:b/>
                 <w:sz w:val="18"/>
               </w:rPr>
               <w:t xml:space="preserve">Source type</w:t>
@@ -1573,15 +1677,18 @@
           </w:p>
         </w:tc>
         <w:tc>
-          <w:tcPr/>
+          <w:tcPr>
+            <w:tcW w:type="dxa" w:w="2823"/>
+          </w:tcPr>
           <w:p>
             <w:pPr>
               <w:pStyle w:val="Compact"/>
-              <w:jc w:val="left"/>
+              <w:jc w:val="center"/>
             </w:pPr>
             <w:r>
               <w:rPr>
                 <w:rFonts w:ascii="Cambria" w:hAnsi="Cambria"/>
+                <w:b/>
                 <w:sz w:val="18"/>
               </w:rPr>
               <w:t xml:space="preserve">Ready (cases)</w:t>
@@ -1589,15 +1696,18 @@
           </w:p>
         </w:tc>
         <w:tc>
-          <w:tcPr/>
+          <w:tcPr>
+            <w:tcW w:type="dxa" w:w="2823"/>
+          </w:tcPr>
           <w:p>
             <w:pPr>
               <w:pStyle w:val="Compact"/>
-              <w:jc w:val="left"/>
+              <w:jc w:val="center"/>
             </w:pPr>
             <w:r>
               <w:rPr>
                 <w:rFonts w:ascii="Cambria" w:hAnsi="Cambria"/>
+                <w:b/>
                 <w:sz w:val="18"/>
               </w:rPr>
               <w:t xml:space="preserve">Not Ready (cases)</w:t>
@@ -1607,7 +1717,9 @@
       </w:tr>
       <w:tr>
         <w:tc>
-          <w:tcPr/>
+          <w:tcPr>
+            <w:tcW w:type="dxa" w:w="3764"/>
+          </w:tcPr>
           <w:p>
             <w:pPr>
               <w:pStyle w:val="Compact"/>
@@ -1623,11 +1735,13 @@
           </w:p>
         </w:tc>
         <w:tc>
-          <w:tcPr/>
+          <w:tcPr>
+            <w:tcW w:type="dxa" w:w="2823"/>
+          </w:tcPr>
           <w:p>
             <w:pPr>
               <w:pStyle w:val="Compact"/>
-              <w:jc w:val="left"/>
+              <w:jc w:val="center"/>
             </w:pPr>
             <w:r>
               <w:rPr>
@@ -1639,11 +1753,13 @@
           </w:p>
         </w:tc>
         <w:tc>
-          <w:tcPr/>
+          <w:tcPr>
+            <w:tcW w:type="dxa" w:w="2823"/>
+          </w:tcPr>
           <w:p>
             <w:pPr>
               <w:pStyle w:val="Compact"/>
-              <w:jc w:val="left"/>
+              <w:jc w:val="center"/>
             </w:pPr>
             <w:r>
               <w:rPr>
@@ -1657,7 +1773,9 @@
       </w:tr>
       <w:tr>
         <w:tc>
-          <w:tcPr/>
+          <w:tcPr>
+            <w:tcW w:type="dxa" w:w="3764"/>
+          </w:tcPr>
           <w:p>
             <w:pPr>
               <w:pStyle w:val="Compact"/>
@@ -1673,11 +1791,13 @@
           </w:p>
         </w:tc>
         <w:tc>
-          <w:tcPr/>
+          <w:tcPr>
+            <w:tcW w:type="dxa" w:w="2823"/>
+          </w:tcPr>
           <w:p>
             <w:pPr>
               <w:pStyle w:val="Compact"/>
-              <w:jc w:val="left"/>
+              <w:jc w:val="center"/>
             </w:pPr>
             <w:r>
               <w:rPr>
@@ -1689,11 +1809,13 @@
           </w:p>
         </w:tc>
         <w:tc>
-          <w:tcPr/>
+          <w:tcPr>
+            <w:tcW w:type="dxa" w:w="2823"/>
+          </w:tcPr>
           <w:p>
             <w:pPr>
               <w:pStyle w:val="Compact"/>
-              <w:jc w:val="left"/>
+              <w:jc w:val="center"/>
             </w:pPr>
             <w:r>
               <w:rPr>
@@ -1724,7 +1846,9 @@
     <w:p>
       <w:pPr>
         <w:pStyle w:val="BodyText"/>
-        <w:spacing w:line="276" w:lineRule="auto"/>
+        <w:spacing w:line="276" w:lineRule="auto" w:before="0" w:after="0"/>
+        <w:ind w:firstLine="283"/>
+        <w:jc w:val="both"/>
       </w:pPr>
       <w:r>
         <w:rPr>
@@ -1747,7 +1871,9 @@
     <w:p>
       <w:pPr>
         <w:pStyle w:val="FirstParagraph"/>
-        <w:spacing w:line="276" w:lineRule="auto"/>
+        <w:spacing w:line="276" w:lineRule="auto" w:before="0" w:after="0"/>
+        <w:ind w:firstLine="283"/>
+        <w:jc w:val="both"/>
       </w:pPr>
       <w:r>
         <w:rPr>
@@ -1776,19 +1902,22 @@
         <w:tblW w:type="pct" w:w="5000"/>
         <w:tblLook w:firstRow="1" w:lastRow="0" w:firstColumn="0" w:lastColumn="0" w:noHBand="0" w:noVBand="0" w:val="0020"/>
         <w:jc w:val="start"/>
+        <w:tblLayout w:type="fixed"/>
       </w:tblPr>
       <w:tblGrid>
-        <w:gridCol w:w="1980"/>
-        <w:gridCol w:w="1980"/>
-        <w:gridCol w:w="1980"/>
-        <w:gridCol w:w="1980"/>
+        <w:gridCol w:w="3764"/>
+        <w:gridCol w:w="1882"/>
+        <w:gridCol w:w="1882"/>
+        <w:gridCol w:w="1882"/>
       </w:tblGrid>
       <w:tr>
         <w:trPr>
           <w:tblHeader w:val="true"/>
         </w:trPr>
         <w:tc>
-          <w:tcPr/>
+          <w:tcPr>
+            <w:tcW w:type="dxa" w:w="3764"/>
+          </w:tcPr>
           <w:p>
             <w:pPr>
               <w:pStyle w:val="Compact"/>
@@ -1797,6 +1926,7 @@
             <w:r>
               <w:rPr>
                 <w:rFonts w:ascii="Cambria" w:hAnsi="Cambria"/>
+                <w:b/>
                 <w:sz w:val="18"/>
               </w:rPr>
               <w:t xml:space="preserve">Read</w:t>
@@ -1804,15 +1934,18 @@
           </w:p>
         </w:tc>
         <w:tc>
-          <w:tcPr/>
+          <w:tcPr>
+            <w:tcW w:type="dxa" w:w="1882"/>
+          </w:tcPr>
           <w:p>
             <w:pPr>
               <w:pStyle w:val="Compact"/>
-              <w:jc w:val="left"/>
+              <w:jc w:val="center"/>
             </w:pPr>
             <w:r>
               <w:rPr>
                 <w:rFonts w:ascii="Cambria" w:hAnsi="Cambria"/>
+                <w:b/>
                 <w:sz w:val="18"/>
               </w:rPr>
               <w:t xml:space="preserve">Sustained (cases)</w:t>
@@ -1820,15 +1953,18 @@
           </w:p>
         </w:tc>
         <w:tc>
-          <w:tcPr/>
+          <w:tcPr>
+            <w:tcW w:type="dxa" w:w="1882"/>
+          </w:tcPr>
           <w:p>
             <w:pPr>
               <w:pStyle w:val="Compact"/>
-              <w:jc w:val="left"/>
+              <w:jc w:val="center"/>
             </w:pPr>
             <w:r>
               <w:rPr>
                 <w:rFonts w:ascii="Cambria" w:hAnsi="Cambria"/>
+                <w:b/>
                 <w:sz w:val="18"/>
               </w:rPr>
               <w:t xml:space="preserve">Did not survive (cases)</w:t>
@@ -1836,15 +1972,18 @@
           </w:p>
         </w:tc>
         <w:tc>
-          <w:tcPr/>
+          <w:tcPr>
+            <w:tcW w:type="dxa" w:w="1882"/>
+          </w:tcPr>
           <w:p>
             <w:pPr>
               <w:pStyle w:val="Compact"/>
-              <w:jc w:val="left"/>
+              <w:jc w:val="center"/>
             </w:pPr>
             <w:r>
               <w:rPr>
                 <w:rFonts w:ascii="Cambria" w:hAnsi="Cambria"/>
+                <w:b/>
                 <w:sz w:val="18"/>
               </w:rPr>
               <w:t xml:space="preserve">Sustained rate (%)</w:t>
@@ -1854,7 +1993,9 @@
       </w:tr>
       <w:tr>
         <w:tc>
-          <w:tcPr/>
+          <w:tcPr>
+            <w:tcW w:type="dxa" w:w="3764"/>
+          </w:tcPr>
           <w:p>
             <w:pPr>
               <w:pStyle w:val="Compact"/>
@@ -1870,11 +2011,13 @@
           </w:p>
         </w:tc>
         <w:tc>
-          <w:tcPr/>
+          <w:tcPr>
+            <w:tcW w:type="dxa" w:w="1882"/>
+          </w:tcPr>
           <w:p>
             <w:pPr>
               <w:pStyle w:val="Compact"/>
-              <w:jc w:val="left"/>
+              <w:jc w:val="center"/>
             </w:pPr>
             <w:r>
               <w:rPr>
@@ -1886,11 +2029,13 @@
           </w:p>
         </w:tc>
         <w:tc>
-          <w:tcPr/>
+          <w:tcPr>
+            <w:tcW w:type="dxa" w:w="1882"/>
+          </w:tcPr>
           <w:p>
             <w:pPr>
               <w:pStyle w:val="Compact"/>
-              <w:jc w:val="left"/>
+              <w:jc w:val="center"/>
             </w:pPr>
             <w:r>
               <w:rPr>
@@ -1902,11 +2047,13 @@
           </w:p>
         </w:tc>
         <w:tc>
-          <w:tcPr/>
+          <w:tcPr>
+            <w:tcW w:type="dxa" w:w="1882"/>
+          </w:tcPr>
           <w:p>
             <w:pPr>
               <w:pStyle w:val="Compact"/>
-              <w:jc w:val="left"/>
+              <w:jc w:val="center"/>
             </w:pPr>
             <w:r>
               <w:rPr>
@@ -1920,7 +2067,9 @@
       </w:tr>
       <w:tr>
         <w:tc>
-          <w:tcPr/>
+          <w:tcPr>
+            <w:tcW w:type="dxa" w:w="3764"/>
+          </w:tcPr>
           <w:p>
             <w:pPr>
               <w:pStyle w:val="Compact"/>
@@ -1936,11 +2085,13 @@
           </w:p>
         </w:tc>
         <w:tc>
-          <w:tcPr/>
+          <w:tcPr>
+            <w:tcW w:type="dxa" w:w="1882"/>
+          </w:tcPr>
           <w:p>
             <w:pPr>
               <w:pStyle w:val="Compact"/>
-              <w:jc w:val="left"/>
+              <w:jc w:val="center"/>
             </w:pPr>
             <w:r>
               <w:rPr>
@@ -1952,11 +2103,13 @@
           </w:p>
         </w:tc>
         <w:tc>
-          <w:tcPr/>
+          <w:tcPr>
+            <w:tcW w:type="dxa" w:w="1882"/>
+          </w:tcPr>
           <w:p>
             <w:pPr>
               <w:pStyle w:val="Compact"/>
-              <w:jc w:val="left"/>
+              <w:jc w:val="center"/>
             </w:pPr>
             <w:r>
               <w:rPr>
@@ -1968,11 +2121,13 @@
           </w:p>
         </w:tc>
         <w:tc>
-          <w:tcPr/>
+          <w:tcPr>
+            <w:tcW w:type="dxa" w:w="1882"/>
+          </w:tcPr>
           <w:p>
             <w:pPr>
               <w:pStyle w:val="Compact"/>
-              <w:jc w:val="left"/>
+              <w:jc w:val="center"/>
             </w:pPr>
             <w:r>
               <w:rPr>
@@ -2003,14 +2158,16 @@
     <w:p>
       <w:pPr>
         <w:pStyle w:val="BodyText"/>
-        <w:spacing w:line="276" w:lineRule="auto"/>
-      </w:pPr>
-      <w:r>
-        <w:rPr>
-          <w:rFonts w:ascii="Cambria" w:hAnsi="Cambria"/>
-          <w:sz w:val="20"/>
-        </w:rPr>
-        <w:t xml:space="preserve">The null result is expected and informative. Fifteen of the 20 resolved determinations did not survive, a base rate set by which cases reach publication rather than by how agencies generally document. A case reaches a published opinion because a legal question is live, and that question is usually about the scope of an exemption rather than the sufficiency of the file. The absence of an association does not mean that reconstructability lacks practical significance. It establishes a boundary for this corpus: reconstructability and appellate disposition should not be treated as interchangeable outcome measures.</w:t>
+        <w:spacing w:line="276" w:lineRule="auto" w:before="0" w:after="0"/>
+        <w:ind w:firstLine="283"/>
+        <w:jc w:val="both"/>
+      </w:pPr>
+      <w:r>
+        <w:rPr>
+          <w:rFonts w:ascii="Cambria" w:hAnsi="Cambria"/>
+          <w:sz w:val="20"/>
+        </w:rPr>
+        <w:t xml:space="preserve">This null result was expected. Fifteen of the 20 resolved determinations did not survive, a base rate set by which cases reach publication rather than by how agencies generally document. A case reaches a published opinion because a legal question is live, and that question is usually about the scope of an exemption rather than the sufficiency of the file. The absence of an association does not mean that reconstructability lacks practical significance. It establishes a boundary for this corpus: reconstructability and appellate disposition should not be treated as interchangeable outcome measures.</w:t>
       </w:r>
     </w:p>
     <w:bookmarkEnd w:id="47"/>
@@ -2026,7 +2183,9 @@
     <w:p>
       <w:pPr>
         <w:pStyle w:val="FirstParagraph"/>
-        <w:spacing w:line="276" w:lineRule="auto"/>
+        <w:spacing w:line="276" w:lineRule="auto" w:before="0" w:after="0"/>
+        <w:ind w:firstLine="283"/>
+        <w:jc w:val="both"/>
       </w:pPr>
       <w:r>
         <w:rPr>
@@ -2039,7 +2198,9 @@
     <w:p>
       <w:pPr>
         <w:pStyle w:val="BodyText"/>
-        <w:spacing w:line="276" w:lineRule="auto"/>
+        <w:spacing w:line="276" w:lineRule="auto" w:before="0" w:after="0"/>
+        <w:ind w:firstLine="283"/>
+        <w:jc w:val="both"/>
       </w:pPr>
       <w:r>
         <w:rPr>
@@ -2072,7 +2233,9 @@
     <w:p>
       <w:pPr>
         <w:pStyle w:val="FirstParagraph"/>
-        <w:spacing w:line="276" w:lineRule="auto"/>
+        <w:spacing w:line="276" w:lineRule="auto" w:before="0" w:after="0"/>
+        <w:ind w:firstLine="283"/>
+        <w:jc w:val="both"/>
       </w:pPr>
       <w:r>
         <w:rPr>
@@ -2095,7 +2258,9 @@
     <w:p>
       <w:pPr>
         <w:pStyle w:val="FirstParagraph"/>
-        <w:spacing w:line="276" w:lineRule="auto"/>
+        <w:spacing w:line="276" w:lineRule="auto" w:before="0" w:after="0"/>
+        <w:ind w:firstLine="283"/>
+        <w:jc w:val="both"/>
       </w:pPr>
       <w:r>
         <w:rPr>
@@ -2108,27 +2273,31 @@
     <w:p>
       <w:pPr>
         <w:pStyle w:val="BodyText"/>
-        <w:spacing w:line="276" w:lineRule="auto"/>
-      </w:pPr>
-      <w:r>
-        <w:rPr>
-          <w:rFonts w:ascii="Cambria" w:hAnsi="Cambria"/>
-          <w:sz w:val="20"/>
-        </w:rPr>
-        <w:t xml:space="preserve">The second is public trust. The evidence reviewed above suggests that transparency builds trust when what is disclosed is intelligible (Grimmelikhuijsen &amp; Meijer, 2014; OECD, 2017) and that people accept adverse decisions more readily when they can see the reasons (Tyler, 2006). A disclosure regime that releases records whose basis cannot be reconstructed delivers the form of transparency without its substance. Record-level reconstructability is one of the conditions under which transparency can do the work that governments and citizens expect of it.</w:t>
+        <w:spacing w:line="276" w:lineRule="auto" w:before="0" w:after="0"/>
+        <w:ind w:firstLine="283"/>
+        <w:jc w:val="both"/>
+      </w:pPr>
+      <w:r>
+        <w:rPr>
+          <w:rFonts w:ascii="Cambria" w:hAnsi="Cambria"/>
+          <w:sz w:val="20"/>
+        </w:rPr>
+        <w:t xml:space="preserve">The second is public trust. The evidence reviewed above suggests that transparency builds trust when what is disclosed is intelligible (Grimmelikhuijsen &amp; Meijer, 2014; OECD, 2017) and that people accept adverse decisions more readily when they can see the reasons (Tyler, 2006). A disclosure regime that releases records whose basis cannot be reconstructed provides formal transparency without enabling readers to understand the basis of decisions. Record-level reconstructability is therefore one of the conditions under which transparency can achieve its intended purposes.</w:t>
       </w:r>
     </w:p>
     <w:p>
       <w:pPr>
         <w:pStyle w:val="BodyText"/>
-        <w:spacing w:line="276" w:lineRule="auto"/>
-      </w:pPr>
-      <w:r>
-        <w:rPr>
-          <w:rFonts w:ascii="Cambria" w:hAnsi="Cambria"/>
-          <w:sz w:val="20"/>
-        </w:rPr>
-        <w:t xml:space="preserve">The third is the governance of automated and AI-assisted administration. As drafting tools generate more of the text of administrative records, the risk is not only that decisions become less accurate but that records become fluent without being reconstructable (Citron, 2008; Pasquale, 2015). Technology inventories of the kind announced by the Chief FOIA Officers Council answer what tools are in use. A documentation read answers whether the outputs hold up. The audit subset shows why both are needed: in all five audits, the failure recorded was evidentiary, an agency unable to show what it had done. That failure is invisible to an inventory of software and visible to a read of the record. Agencies could, alongside technology modernisation, sample their own determinations for reconstructability and so detect the case in which better tooling produces fluent but unreconstructable records.</w:t>
+        <w:spacing w:line="276" w:lineRule="auto" w:before="0" w:after="0"/>
+        <w:ind w:firstLine="283"/>
+        <w:jc w:val="both"/>
+      </w:pPr>
+      <w:r>
+        <w:rPr>
+          <w:rFonts w:ascii="Cambria" w:hAnsi="Cambria"/>
+          <w:sz w:val="20"/>
+        </w:rPr>
+        <w:t xml:space="preserve">The third is the governance of automated and AI-assisted administration. As drafting tools generate more of the text of administrative records, one risk is that records become well written without being reconstructable (Citron, 2008; Pasquale, 2015). Technology inventories of the kind announced by the Chief FOIA Officers Council answer what tools are in use. A documentation read answers whether the outputs hold up. The audit subset shows why both are needed: in all five audits, the failure recorded was evidentiary, an agency unable to show what it had done. That failure is invisible to an inventory of software and visible to a read of the record. Agencies could, alongside technology modernisation, sample their own determinations for reconstructability and so detect cases in which new tools produce well-written but unreconstructable records.</w:t>
       </w:r>
     </w:p>
     <w:bookmarkEnd w:id="51"/>
@@ -2144,20 +2313,24 @@
     <w:p>
       <w:pPr>
         <w:pStyle w:val="FirstParagraph"/>
-        <w:spacing w:line="276" w:lineRule="auto"/>
-      </w:pPr>
-      <w:r>
-        <w:rPr>
-          <w:rFonts w:ascii="Cambria" w:hAnsi="Cambria"/>
-          <w:sz w:val="20"/>
-        </w:rPr>
-        <w:t xml:space="preserve">The findings support three potential uses of reconstructability review, while not establishing that the review improves substantive outcomes. The first is pre-finalisation quality assurance. A record can be reviewed while the underlying matter remains active, by asking whether an informed reviewer who did not participate in the decision could understand its evidentiary basis and reasoning from the record available to them. Put simply: if the decision-maker were unavailable and a later reviewer had only the record, could that reviewer identify what was decided, what information supported it, and how the stated conclusion followed from that information? This does not require agencies to preserve every intermediate thought or drafting artefact. It requires attention to whether the record ultimately retained is sufficient to reconstruct the basis of the action it documents.</w:t>
+        <w:spacing w:line="276" w:lineRule="auto" w:before="0" w:after="0"/>
+        <w:ind w:firstLine="283"/>
+        <w:jc w:val="both"/>
+      </w:pPr>
+      <w:r>
+        <w:rPr>
+          <w:rFonts w:ascii="Cambria" w:hAnsi="Cambria"/>
+          <w:sz w:val="20"/>
+        </w:rPr>
+        <w:t xml:space="preserve">The findings support three potential uses of reconstructability review, while not establishing that the review improves substantive outcomes. The first is pre-finalisation quality assurance. A record can be reviewed while the underlying matter remains active, by asking whether an informed reviewer who did not participate in the decision could understand its evidentiary basis and reasoning from the record available to them. The practical test is this: if the decision-maker were unavailable and a later reviewer had only the record, could that reviewer identify what was decided, what information supported it, and how the stated conclusion followed from that information? This does not require agencies to preserve every intermediate thought or drafting artefact. It requires attention to whether the record ultimately retained is sufficient to reconstruct the basis of the action it documents.</w:t>
       </w:r>
     </w:p>
     <w:p>
       <w:pPr>
         <w:pStyle w:val="BodyText"/>
-        <w:spacing w:line="276" w:lineRule="auto"/>
+        <w:spacing w:line="276" w:lineRule="auto" w:before="0" w:after="0"/>
+        <w:ind w:firstLine="283"/>
+        <w:jc w:val="both"/>
       </w:pPr>
       <w:r>
         <w:rPr>
@@ -2180,7 +2353,9 @@
     <w:p>
       <w:pPr>
         <w:pStyle w:val="FirstParagraph"/>
-        <w:spacing w:line="276" w:lineRule="auto"/>
+        <w:spacing w:line="276" w:lineRule="auto" w:before="0" w:after="0"/>
+        <w:ind w:firstLine="283"/>
+        <w:jc w:val="both"/>
       </w:pPr>
       <w:r>
         <w:rPr>
@@ -2193,7 +2368,9 @@
     <w:p>
       <w:pPr>
         <w:pStyle w:val="BodyText"/>
-        <w:spacing w:line="276" w:lineRule="auto"/>
+        <w:spacing w:line="276" w:lineRule="auto" w:before="0" w:after="0"/>
+        <w:ind w:firstLine="283"/>
+        <w:jc w:val="both"/>
       </w:pPr>
       <w:r>
         <w:rPr>
@@ -2206,7 +2383,9 @@
     <w:p>
       <w:pPr>
         <w:pStyle w:val="BodyText"/>
-        <w:spacing w:line="276" w:lineRule="auto"/>
+        <w:spacing w:line="276" w:lineRule="auto" w:before="0" w:after="0"/>
+        <w:ind w:firstLine="283"/>
+        <w:jc w:val="both"/>
       </w:pPr>
       <w:r>
         <w:rPr>
@@ -2219,7 +2398,9 @@
     <w:p>
       <w:pPr>
         <w:pStyle w:val="BodyText"/>
-        <w:spacing w:line="276" w:lineRule="auto"/>
+        <w:spacing w:line="276" w:lineRule="auto" w:before="0" w:after="0"/>
+        <w:ind w:firstLine="283"/>
+        <w:jc w:val="both"/>
       </w:pPr>
       <w:r>
         <w:rPr>
@@ -2232,7 +2413,9 @@
     <w:p>
       <w:pPr>
         <w:pStyle w:val="BodyText"/>
-        <w:spacing w:line="276" w:lineRule="auto"/>
+        <w:spacing w:line="276" w:lineRule="auto" w:before="0" w:after="0"/>
+        <w:ind w:firstLine="283"/>
+        <w:jc w:val="both"/>
       </w:pPr>
       <w:r>
         <w:rPr>
@@ -2256,7 +2439,9 @@
     <w:p>
       <w:pPr>
         <w:pStyle w:val="FirstParagraph"/>
-        <w:spacing w:line="276" w:lineRule="auto"/>
+        <w:spacing w:line="276" w:lineRule="auto" w:before="0" w:after="0"/>
+        <w:ind w:firstLine="283"/>
+        <w:jc w:val="both"/>
       </w:pPr>
       <w:r>
         <w:rPr>
@@ -2269,7 +2454,9 @@
     <w:p>
       <w:pPr>
         <w:pStyle w:val="BodyText"/>
-        <w:spacing w:line="276" w:lineRule="auto"/>
+        <w:spacing w:line="276" w:lineRule="auto" w:before="0" w:after="0"/>
+        <w:ind w:firstLine="283"/>
+        <w:jc w:val="both"/>
       </w:pPr>
       <w:r>
         <w:rPr>
@@ -2282,14 +2469,16 @@
     <w:p>
       <w:pPr>
         <w:pStyle w:val="BodyText"/>
-        <w:spacing w:line="276" w:lineRule="auto"/>
-      </w:pPr>
-      <w:r>
-        <w:rPr>
-          <w:rFonts w:ascii="Cambria" w:hAnsi="Cambria"/>
-          <w:sz w:val="20"/>
-        </w:rPr>
-        <w:t xml:space="preserve">The contribution is not a fully validated measurement instrument or a demonstration that the review improves administrative outcomes. It is narrower: initial empirical evidence that reconstructability can be examined systematically at the level of an individual consequential record. That matters beyond records offices. Unreconstructable records shift the cost of accountability onto requesters, tribunals and auditors, weaken the link between transparency and public trust, and become more likely as automated tools take on the drafting of administrative records. For records and information governance, the findings raise a practical question alongside retention and preservation: when a decision must later be explained, does the record itself preserve enough of its evidentiary basis and reasoning for an independent reviewer to reconstruct how the organisation acted?</w:t>
+        <w:spacing w:line="276" w:lineRule="auto" w:before="0" w:after="0"/>
+        <w:ind w:firstLine="283"/>
+        <w:jc w:val="both"/>
+      </w:pPr>
+      <w:r>
+        <w:rPr>
+          <w:rFonts w:ascii="Cambria" w:hAnsi="Cambria"/>
+          <w:sz w:val="20"/>
+        </w:rPr>
+        <w:t xml:space="preserve">The study does not offer a fully validated measurement instrument or show that the review improves administrative outcomes. Its contribution is more limited: initial empirical evidence that reconstructability can be examined systematically at the level of an individual consequential record. The implications extend beyond records offices. Unreconstructable records shift the cost of accountability onto requesters, tribunals and auditors, weaken the link between transparency and public trust, and become more likely as automated tools take on the drafting of administrative records. For records and information governance, the findings raise a practical question alongside retention and preservation: when a decision must later be explained, does the record itself preserve enough of its evidentiary basis and reasoning for an independent reviewer to reconstruct how the organisation acted?</w:t>
       </w:r>
     </w:p>
     <w:bookmarkEnd w:id="55"/>
@@ -2305,7 +2494,9 @@
     <w:p>
       <w:pPr>
         <w:pStyle w:val="FirstParagraph"/>
-        <w:spacing w:line="276" w:lineRule="auto"/>
+        <w:spacing w:line="276" w:lineRule="auto" w:before="0" w:after="0"/>
+        <w:ind w:firstLine="283"/>
+        <w:jc w:val="both"/>
       </w:pPr>
       <w:r>
         <w:rPr>
@@ -2318,7 +2509,9 @@
     <w:p>
       <w:pPr>
         <w:pStyle w:val="BodyText"/>
-        <w:spacing w:line="276" w:lineRule="auto"/>
+        <w:spacing w:line="276" w:lineRule="auto" w:before="0" w:after="0"/>
+        <w:ind w:firstLine="283"/>
+        <w:jc w:val="both"/>
       </w:pPr>
       <w:r>
         <w:rPr>
@@ -2341,7 +2534,9 @@
     <w:p>
       <w:pPr>
         <w:pStyle w:val="FirstParagraph"/>
-        <w:spacing w:line="276" w:lineRule="auto"/>
+        <w:spacing w:line="276" w:lineRule="auto" w:before="0" w:after="0"/>
+        <w:ind w:firstLine="283"/>
+        <w:jc w:val="both"/>
       </w:pPr>
       <w:r>
         <w:rPr>
@@ -2364,7 +2559,9 @@
     <w:p>
       <w:pPr>
         <w:pStyle w:val="FirstParagraph"/>
-        <w:spacing w:line="276" w:lineRule="auto"/>
+        <w:spacing w:line="276" w:lineRule="auto" w:before="0" w:after="0"/>
+        <w:ind w:firstLine="283"/>
+        <w:jc w:val="both"/>
       </w:pPr>
       <w:r>
         <w:rPr>
@@ -2387,7 +2584,9 @@
     <w:p>
       <w:pPr>
         <w:pStyle w:val="FirstParagraph"/>
-        <w:spacing w:line="276" w:lineRule="auto"/>
+        <w:spacing w:line="276" w:lineRule="auto" w:before="0" w:after="0"/>
+        <w:ind w:firstLine="283"/>
+        <w:jc w:val="both"/>
       </w:pPr>
       <w:r>
         <w:rPr>
@@ -2410,7 +2609,9 @@
     <w:p>
       <w:pPr>
         <w:pStyle w:val="FirstParagraph"/>
-        <w:spacing w:line="276" w:lineRule="auto"/>
+        <w:spacing w:line="276" w:lineRule="auto" w:before="0" w:after="0"/>
+        <w:ind w:firstLine="283"/>
+        <w:jc w:val="both"/>
       </w:pPr>
       <w:r>
         <w:rPr>
@@ -2433,7 +2634,9 @@
     <w:p>
       <w:pPr>
         <w:pStyle w:val="FirstParagraph"/>
-        <w:spacing w:line="276" w:lineRule="auto"/>
+        <w:spacing w:line="276" w:lineRule="auto" w:before="0" w:after="0"/>
+        <w:ind w:firstLine="283"/>
+        <w:jc w:val="both"/>
       </w:pPr>
       <w:r>
         <w:rPr>
@@ -2456,7 +2659,9 @@
     <w:p>
       <w:pPr>
         <w:pStyle w:val="FirstParagraph"/>
-        <w:spacing w:line="276" w:lineRule="auto"/>
+        <w:spacing w:line="276" w:lineRule="auto" w:before="0" w:after="0"/>
+        <w:ind w:firstLine="283"/>
+        <w:jc w:val="both"/>
       </w:pPr>
       <w:r>
         <w:rPr>
@@ -2479,7 +2684,9 @@
     <w:p>
       <w:pPr>
         <w:pStyle w:val="FirstParagraph"/>
-        <w:spacing w:line="276" w:lineRule="auto"/>
+        <w:spacing w:line="276" w:lineRule="auto" w:before="0" w:after="0"/>
+        <w:ind w:firstLine="283"/>
+        <w:jc w:val="both"/>
       </w:pPr>
       <w:r>
         <w:rPr>
@@ -2502,7 +2709,9 @@
     <w:p>
       <w:pPr>
         <w:pStyle w:val="FirstParagraph"/>
-        <w:spacing w:line="276" w:lineRule="auto"/>
+        <w:spacing w:line="276" w:lineRule="auto" w:before="0" w:after="0"/>
+        <w:ind w:firstLine="283"/>
+        <w:jc w:val="both"/>
       </w:pPr>
       <w:r>
         <w:rPr>
@@ -2525,7 +2734,9 @@
     <w:p>
       <w:pPr>
         <w:pStyle w:val="FirstParagraph"/>
-        <w:spacing w:line="276" w:lineRule="auto"/>
+        <w:spacing w:line="276" w:lineRule="auto" w:before="0" w:after="60"/>
+        <w:ind w:left="283" w:hanging="283"/>
+        <w:jc w:val="both"/>
       </w:pPr>
       <w:r>
         <w:rPr>
@@ -2561,7 +2772,9 @@
     <w:p>
       <w:pPr>
         <w:pStyle w:val="BodyText"/>
-        <w:spacing w:line="276" w:lineRule="auto"/>
+        <w:spacing w:line="276" w:lineRule="auto" w:before="0" w:after="60"/>
+        <w:ind w:left="283" w:hanging="283"/>
+        <w:jc w:val="both"/>
       </w:pPr>
       <w:r>
         <w:rPr>
@@ -2604,7 +2817,9 @@
     <w:p>
       <w:pPr>
         <w:pStyle w:val="BodyText"/>
-        <w:spacing w:line="276" w:lineRule="auto"/>
+        <w:spacing w:line="276" w:lineRule="auto" w:before="0" w:after="60"/>
+        <w:ind w:left="283" w:hanging="283"/>
+        <w:jc w:val="both"/>
       </w:pPr>
       <w:r>
         <w:rPr>
@@ -2640,7 +2855,9 @@
     <w:p>
       <w:pPr>
         <w:pStyle w:val="BodyText"/>
-        <w:spacing w:line="276" w:lineRule="auto"/>
+        <w:spacing w:line="276" w:lineRule="auto" w:before="0" w:after="60"/>
+        <w:ind w:left="283" w:hanging="283"/>
+        <w:jc w:val="both"/>
       </w:pPr>
       <w:r>
         <w:rPr>
@@ -2676,7 +2893,9 @@
     <w:p>
       <w:pPr>
         <w:pStyle w:val="BodyText"/>
-        <w:spacing w:line="276" w:lineRule="auto"/>
+        <w:spacing w:line="276" w:lineRule="auto" w:before="0" w:after="60"/>
+        <w:ind w:left="283" w:hanging="283"/>
+        <w:jc w:val="both"/>
       </w:pPr>
       <w:r>
         <w:rPr>
@@ -2712,7 +2931,9 @@
     <w:p>
       <w:pPr>
         <w:pStyle w:val="BodyText"/>
-        <w:spacing w:line="276" w:lineRule="auto"/>
+        <w:spacing w:line="276" w:lineRule="auto" w:before="0" w:after="60"/>
+        <w:ind w:left="283" w:hanging="283"/>
+        <w:jc w:val="both"/>
       </w:pPr>
       <w:r>
         <w:rPr>
@@ -2748,7 +2969,9 @@
     <w:p>
       <w:pPr>
         <w:pStyle w:val="BodyText"/>
-        <w:spacing w:line="276" w:lineRule="auto"/>
+        <w:spacing w:line="276" w:lineRule="auto" w:before="0" w:after="60"/>
+        <w:ind w:left="283" w:hanging="283"/>
+        <w:jc w:val="both"/>
       </w:pPr>
       <w:r>
         <w:rPr>
@@ -2784,7 +3007,9 @@
     <w:p>
       <w:pPr>
         <w:pStyle w:val="BodyText"/>
-        <w:spacing w:line="276" w:lineRule="auto"/>
+        <w:spacing w:line="276" w:lineRule="auto" w:before="0" w:after="60"/>
+        <w:ind w:left="283" w:hanging="283"/>
+        <w:jc w:val="both"/>
       </w:pPr>
       <w:r>
         <w:rPr>
@@ -2820,7 +3045,9 @@
     <w:p>
       <w:pPr>
         <w:pStyle w:val="BodyText"/>
-        <w:spacing w:line="276" w:lineRule="auto"/>
+        <w:spacing w:line="276" w:lineRule="auto" w:before="0" w:after="60"/>
+        <w:ind w:left="283" w:hanging="283"/>
+        <w:jc w:val="both"/>
       </w:pPr>
       <w:r>
         <w:rPr>
@@ -2863,7 +3090,9 @@
     <w:p>
       <w:pPr>
         <w:pStyle w:val="BodyText"/>
-        <w:spacing w:line="276" w:lineRule="auto"/>
+        <w:spacing w:line="276" w:lineRule="auto" w:before="0" w:after="60"/>
+        <w:ind w:left="283" w:hanging="283"/>
+        <w:jc w:val="both"/>
       </w:pPr>
       <w:r>
         <w:rPr>
@@ -2899,7 +3128,9 @@
     <w:p>
       <w:pPr>
         <w:pStyle w:val="BodyText"/>
-        <w:spacing w:line="276" w:lineRule="auto"/>
+        <w:spacing w:line="276" w:lineRule="auto" w:before="0" w:after="60"/>
+        <w:ind w:left="283" w:hanging="283"/>
+        <w:jc w:val="both"/>
       </w:pPr>
       <w:r>
         <w:rPr>
@@ -2935,7 +3166,9 @@
     <w:p>
       <w:pPr>
         <w:pStyle w:val="BodyText"/>
-        <w:spacing w:line="276" w:lineRule="auto"/>
+        <w:spacing w:line="276" w:lineRule="auto" w:before="0" w:after="60"/>
+        <w:ind w:left="283" w:hanging="283"/>
+        <w:jc w:val="both"/>
       </w:pPr>
       <w:r>
         <w:rPr>
@@ -2971,7 +3204,9 @@
     <w:p>
       <w:pPr>
         <w:pStyle w:val="BodyText"/>
-        <w:spacing w:line="276" w:lineRule="auto"/>
+        <w:spacing w:line="276" w:lineRule="auto" w:before="0" w:after="60"/>
+        <w:ind w:left="283" w:hanging="283"/>
+        <w:jc w:val="both"/>
       </w:pPr>
       <w:r>
         <w:rPr>
@@ -3007,7 +3242,9 @@
     <w:p>
       <w:pPr>
         <w:pStyle w:val="BodyText"/>
-        <w:spacing w:line="276" w:lineRule="auto"/>
+        <w:spacing w:line="276" w:lineRule="auto" w:before="0" w:after="60"/>
+        <w:ind w:left="283" w:hanging="283"/>
+        <w:jc w:val="both"/>
       </w:pPr>
       <w:r>
         <w:rPr>
@@ -3043,7 +3280,9 @@
     <w:p>
       <w:pPr>
         <w:pStyle w:val="BodyText"/>
-        <w:spacing w:line="276" w:lineRule="auto"/>
+        <w:spacing w:line="276" w:lineRule="auto" w:before="0" w:after="60"/>
+        <w:ind w:left="283" w:hanging="283"/>
+        <w:jc w:val="both"/>
       </w:pPr>
       <w:r>
         <w:rPr>
@@ -3079,7 +3318,9 @@
     <w:p>
       <w:pPr>
         <w:pStyle w:val="BodyText"/>
-        <w:spacing w:line="276" w:lineRule="auto"/>
+        <w:spacing w:line="276" w:lineRule="auto" w:before="0" w:after="60"/>
+        <w:ind w:left="283" w:hanging="283"/>
+        <w:jc w:val="both"/>
       </w:pPr>
       <w:r>
         <w:rPr>
@@ -3115,7 +3356,9 @@
     <w:p>
       <w:pPr>
         <w:pStyle w:val="BodyText"/>
-        <w:spacing w:line="276" w:lineRule="auto"/>
+        <w:spacing w:line="276" w:lineRule="auto" w:before="0" w:after="60"/>
+        <w:ind w:left="283" w:hanging="283"/>
+        <w:jc w:val="both"/>
       </w:pPr>
       <w:r>
         <w:rPr>
@@ -3151,7 +3394,9 @@
     <w:p>
       <w:pPr>
         <w:pStyle w:val="BodyText"/>
-        <w:spacing w:line="276" w:lineRule="auto"/>
+        <w:spacing w:line="276" w:lineRule="auto" w:before="0" w:after="60"/>
+        <w:ind w:left="283" w:hanging="283"/>
+        <w:jc w:val="both"/>
       </w:pPr>
       <w:r>
         <w:rPr>
@@ -3187,7 +3432,9 @@
     <w:p>
       <w:pPr>
         <w:pStyle w:val="BodyText"/>
-        <w:spacing w:line="276" w:lineRule="auto"/>
+        <w:spacing w:line="276" w:lineRule="auto" w:before="0" w:after="60"/>
+        <w:ind w:left="283" w:hanging="283"/>
+        <w:jc w:val="both"/>
       </w:pPr>
       <w:r>
         <w:rPr>
@@ -3223,7 +3470,9 @@
     <w:p>
       <w:pPr>
         <w:pStyle w:val="BodyText"/>
-        <w:spacing w:line="276" w:lineRule="auto"/>
+        <w:spacing w:line="276" w:lineRule="auto" w:before="0" w:after="60"/>
+        <w:ind w:left="283" w:hanging="283"/>
+        <w:jc w:val="both"/>
       </w:pPr>
       <w:r>
         <w:rPr>
@@ -3268,7 +3517,9 @@
     <w:p>
       <w:pPr>
         <w:pStyle w:val="FirstParagraph"/>
-        <w:spacing w:line="276" w:lineRule="auto"/>
+        <w:spacing w:line="276" w:lineRule="auto" w:before="0" w:after="60"/>
+        <w:ind w:left="283" w:hanging="283"/>
+        <w:jc w:val="both"/>
       </w:pPr>
       <w:r>
         <w:rPr>
@@ -3281,7 +3532,9 @@
     <w:p>
       <w:pPr>
         <w:pStyle w:val="BodyText"/>
-        <w:spacing w:line="276" w:lineRule="auto"/>
+        <w:spacing w:line="276" w:lineRule="auto" w:before="0" w:after="60"/>
+        <w:ind w:left="283" w:hanging="283"/>
+        <w:jc w:val="both"/>
       </w:pPr>
       <w:r>
         <w:rPr>
@@ -3294,7 +3547,9 @@
     <w:p>
       <w:pPr>
         <w:pStyle w:val="BodyText"/>
-        <w:spacing w:line="276" w:lineRule="auto"/>
+        <w:spacing w:line="276" w:lineRule="auto" w:before="0" w:after="60"/>
+        <w:ind w:left="283" w:hanging="283"/>
+        <w:jc w:val="both"/>
       </w:pPr>
       <w:r>
         <w:rPr>
@@ -3307,7 +3562,9 @@
     <w:p>
       <w:pPr>
         <w:pStyle w:val="BodyText"/>
-        <w:spacing w:line="276" w:lineRule="auto"/>
+        <w:spacing w:line="276" w:lineRule="auto" w:before="0" w:after="60"/>
+        <w:ind w:left="283" w:hanging="283"/>
+        <w:jc w:val="both"/>
       </w:pPr>
       <w:r>
         <w:rPr>
@@ -3428,123 +3685,8 @@
       </w:pPr>
     </w:lvl>
   </w:abstractNum>
-  <w:abstractNum w:abstractNumId="99411">
-    <w:nsid w:val="A99411"/>
-    <w:multiLevelType w:val="multilevel"/>
-    <w:lvl w:ilvl="0">
-      <w:start w:val="1"/>
-      <w:numFmt w:val="decimal"/>
-      <w:lvlText w:val="%1."/>
-      <w:lvlJc w:val="left"/>
-      <w:pPr>
-        <w:ind w:left="720" w:hanging="480"/>
-      </w:pPr>
-    </w:lvl>
-    <w:lvl w:ilvl="1">
-      <w:start w:val="1"/>
-      <w:numFmt w:val="decimal"/>
-      <w:lvlText w:val="%2."/>
-      <w:lvlJc w:val="left"/>
-      <w:pPr>
-        <w:ind w:left="1440" w:hanging="480"/>
-      </w:pPr>
-    </w:lvl>
-    <w:lvl w:ilvl="2">
-      <w:start w:val="1"/>
-      <w:numFmt w:val="decimal"/>
-      <w:lvlText w:val="%3."/>
-      <w:lvlJc w:val="left"/>
-      <w:pPr>
-        <w:ind w:left="2160" w:hanging="480"/>
-      </w:pPr>
-    </w:lvl>
-    <w:lvl w:ilvl="3">
-      <w:start w:val="1"/>
-      <w:numFmt w:val="decimal"/>
-      <w:lvlText w:val="%4."/>
-      <w:lvlJc w:val="left"/>
-      <w:pPr>
-        <w:ind w:left="2880" w:hanging="480"/>
-      </w:pPr>
-    </w:lvl>
-    <w:lvl w:ilvl="4">
-      <w:start w:val="1"/>
-      <w:numFmt w:val="decimal"/>
-      <w:lvlText w:val="%5."/>
-      <w:lvlJc w:val="left"/>
-      <w:pPr>
-        <w:ind w:left="3600" w:hanging="480"/>
-      </w:pPr>
-    </w:lvl>
-    <w:lvl w:ilvl="5">
-      <w:start w:val="1"/>
-      <w:numFmt w:val="decimal"/>
-      <w:lvlText w:val="%6."/>
-      <w:lvlJc w:val="left"/>
-      <w:pPr>
-        <w:ind w:left="4320" w:hanging="480"/>
-      </w:pPr>
-    </w:lvl>
-    <w:lvl w:ilvl="6">
-      <w:start w:val="1"/>
-      <w:numFmt w:val="decimal"/>
-      <w:lvlText w:val="%7."/>
-      <w:lvlJc w:val="left"/>
-      <w:pPr>
-        <w:ind w:left="5040" w:hanging="480"/>
-      </w:pPr>
-    </w:lvl>
-    <w:lvl w:ilvl="7">
-      <w:start w:val="1"/>
-      <w:numFmt w:val="decimal"/>
-      <w:lvlText w:val="%8."/>
-      <w:lvlJc w:val="left"/>
-      <w:pPr>
-        <w:ind w:left="5760" w:hanging="480"/>
-      </w:pPr>
-    </w:lvl>
-    <w:lvl w:ilvl="8">
-      <w:start w:val="1"/>
-      <w:numFmt w:val="decimal"/>
-      <w:lvlText w:val="%9."/>
-      <w:lvlJc w:val="left"/>
-      <w:pPr>
-        <w:ind w:left="6480" w:hanging="480"/>
-      </w:pPr>
-    </w:lvl>
-  </w:abstractNum>
   <w:num w:numId="1000">
     <w:abstractNumId w:val="990"/>
-  </w:num>
-  <w:num w:numId="1001">
-    <w:abstractNumId w:val="99411"/>
-    <w:lvlOverride w:ilvl="0">
-      <w:startOverride w:val="1"/>
-    </w:lvlOverride>
-    <w:lvlOverride w:ilvl="1">
-      <w:startOverride w:val="1"/>
-    </w:lvlOverride>
-    <w:lvlOverride w:ilvl="2">
-      <w:startOverride w:val="1"/>
-    </w:lvlOverride>
-    <w:lvlOverride w:ilvl="3">
-      <w:startOverride w:val="1"/>
-    </w:lvlOverride>
-    <w:lvlOverride w:ilvl="4">
-      <w:startOverride w:val="1"/>
-    </w:lvlOverride>
-    <w:lvlOverride w:ilvl="5">
-      <w:startOverride w:val="1"/>
-    </w:lvlOverride>
-    <w:lvlOverride w:ilvl="6">
-      <w:startOverride w:val="1"/>
-    </w:lvlOverride>
-    <w:lvlOverride w:ilvl="7">
-      <w:startOverride w:val="1"/>
-    </w:lvlOverride>
-    <w:lvlOverride w:ilvl="8">
-      <w:startOverride w:val="1"/>
-    </w:lvlOverride>
   </w:num>
 </w:numbering>
 </file>
@@ -8708,6 +8850,60 @@
       <w:u w:val="single"/>
     </w:rPr>
   </w:style>
+  <w:style w:default="1" w:styleId="Table" w:type="table">
+    <w:name w:val="Table"/>
+    <w:basedOn w:val="TableNormal"/>
+    <w:semiHidden/>
+    <w:unhideWhenUsed/>
+    <w:qFormat/>
+    <w:tblPr>
+      <w:tblInd w:type="dxa" w:w="0"/>
+      <w:tblCellMar>
+        <w:top w:type="dxa" w:w="0"/>
+        <w:left w:type="dxa" w:w="108"/>
+        <w:bottom w:type="dxa" w:w="0"/>
+        <w:right w:type="dxa" w:w="108"/>
+      </w:tblCellMar>
+    </w:tblPr>
+    <w:tblStylePr w:type="firstRow">
+      <w:tblPr>
+        <w:jc w:val="left"/>
+        <w:tblInd w:type="dxa" w:w="0"/>
+      </w:tblPr>
+      <w:trPr>
+        <w:jc w:val="left"/>
+      </w:trPr>
+      <w:tcPr>
+        <w:vAlign w:val="bottom"/>
+        <w:tcBorders>
+          <w:bottom w:val="single"/>
+        </w:tcBorders>
+      </w:tcPr>
+    </w:tblStylePr>
+  </w:style>
+  <w:style w:customStyle="1" w:styleId="Compact" w:type="paragraph">
+    <w:name w:val="Compact"/>
+    <w:basedOn w:val="BodyText"/>
+    <w:qFormat/>
+    <w:pPr>
+      <w:spacing w:after="36" w:before="36"/>
+    </w:pPr>
+  </w:style>
+  <w:style w:customStyle="1" w:styleId="ImageCaption" w:type="paragraph">
+    <w:name w:val="Image Caption"/>
+    <w:basedOn w:val="Caption"/>
+  </w:style>
+  <w:style w:customStyle="1" w:styleId="CaptionedFigure" w:type="paragraph">
+    <w:name w:val="Captioned Figure"/>
+    <w:basedOn w:val="Figure"/>
+    <w:pPr>
+      <w:keepNext/>
+    </w:pPr>
+  </w:style>
+  <w:style w:customStyle="1" w:styleId="Figure" w:type="paragraph">
+    <w:name w:val="Figure"/>
+    <w:basedOn w:val="Normal"/>
+  </w:style>
   <w:style w:type="paragraph" w:customStyle="1" w:styleId="AbstractText">
     <w:name w:val="AbstractText"/>
     <w:basedOn w:val="BodyText"/>

</xml_diff>

<commit_message>
Second edit pass on SEC manuscript; draft message to first author
Co-Authored-By: Claude Opus 5.5 <noreply@anthropic.com>
Claude-Session: https://claude.ai/code/session_01EwYX7947LH3EDG8rbKyfAp
</commit_message>
<xml_diff>
--- a/research/submissions/SEC_2026-10-21/Young_Wikes_SEC_manuscript.docx
+++ b/research/submissions/SEC_2026-10-21/Young_Wikes_SEC_manuscript.docx
@@ -465,7 +465,7 @@
           <w:rFonts w:ascii="Cambria" w:hAnsi="Cambria"/>
           <w:sz w:val="20"/>
         </w:rPr>
-        <w:t xml:space="preserve">The scope of the contribution is limited. The study does not claim that the review improves administrative outcomes or that its results generalise beyond the material sampled. It provides initial evidence that reconstructability can be examined systematically at the level of an individual consequential record, and it sets out why that property matters for the economics of accountability and public trust.</w:t>
+        <w:t xml:space="preserve">The scope of the contribution is limited. The study does not claim that the review improves administrative outcomes or that its results generalise beyond the material sampled. It provides initial evidence that this property can be assessed at the level of the individual record, and it sets out why that matters for the economics of accountability and for public trust.</w:t>
       </w:r>
     </w:p>
     <w:bookmarkEnd w:id="20"/>
@@ -824,7 +824,7 @@
           <w:rFonts w:ascii="Cambria" w:hAnsi="Cambria"/>
           <w:sz w:val="20"/>
         </w:rPr>
-        <w:t xml:space="preserve">Five analyses are reported, in the following order.</w:t>
+        <w:t xml:space="preserve">Four comparisons are reported, followed by a reliability check.</w:t>
       </w:r>
     </w:p>
     <w:p>
@@ -884,7 +884,7 @@
           <w:rFonts w:ascii="Cambria" w:hAnsi="Cambria"/>
           <w:sz w:val="20"/>
         </w:rPr>
-        <w:t xml:space="preserve">The specification check tests the read against appellate disposition. Cases where the source records no resolved disposition are excluded rather than assigned one.</w:t>
+        <w:t xml:space="preserve">A specification check tests whether the read merely tracks the outcome, by comparing it with appellate disposition. Cases where the source records no resolved disposition are excluded rather than assigned one.</w:t>
       </w:r>
     </w:p>
     <w:p>
@@ -2242,7 +2242,7 @@
           <w:rFonts w:ascii="Cambria" w:hAnsi="Cambria"/>
           <w:sz w:val="20"/>
         </w:rPr>
-        <w:t xml:space="preserve">This pilot provides preliminary evidence that record reconstructability can be examined systematically across public-records material. The review produced the full range of classifications across four document classes, agreed with independent audit findings in the five cases where an audit provided a comparable assessment, and differentiated sources by a structural feature that does not depend on the reviewer’s own explanatory language. The coding of contemporaneous basis notes adds that the classifications cohere with their recorded reasons. A determination may be preserved, accessible and formally complete while still failing to preserve the basis on which the agency acted. Reviewability therefore depends not only on whether the record survives, but on whether the relationship between the decision, its supporting information and its stated reasoning remains available to a later reviewer.</w:t>
+        <w:t xml:space="preserve">Taken together, the results suggest that reconstructability can be assessed consistently across different kinds of public-records material. The two analyses that do not rely on the reviewer’s own notes, the audit comparison and the structural comparison, point in the same direction as the note coding, although they share cases and none is independent validation. A determination may be preserved, accessible and formally complete while still failing to preserve the basis on which the agency acted. Reviewability therefore depends not only on whether the record survives, but on whether the relationship between the decision, its supporting information and its stated reasoning remains available to a later reviewer.</w:t>
       </w:r>
     </w:p>
     <w:bookmarkEnd w:id="50"/>
@@ -2362,7 +2362,7 @@
           <w:rFonts w:ascii="Cambria" w:hAnsi="Cambria"/>
           <w:sz w:val="20"/>
         </w:rPr>
-        <w:t xml:space="preserve">The study should be read as an initial feasibility and validation exercise rather than as a population estimate of documentation quality in public-records programmes.</w:t>
+        <w:t xml:space="preserve">The study should be read as an initial feasibility exercise rather than as a population estimate of documentation quality in public-records programmes.</w:t>
       </w:r>
     </w:p>
     <w:p>
@@ -2463,7 +2463,7 @@
           <w:rFonts w:ascii="Cambria" w:hAnsi="Cambria"/>
           <w:sz w:val="20"/>
         </w:rPr>
-        <w:t xml:space="preserve">This pilot examined that question across 32 publicly available public-records cases representing four document classes and two jurisdictions. A structured record-level read produced the full range of classifications, agreed with independent audit findings in the five cases where they were available, and distinguished sources that expose the basis of a determination from sources that leave it difficult or impossible to reconstruct. The read was not associated with appellate outcome, which indicates that reconstructability and substantive outcome are different properties of a decision.</w:t>
+        <w:t xml:space="preserve">This pilot examined that question across 32 publicly available cases from four document classes and two jurisdictions. A structured record-level read produced the full range of classifications, agreed with independent audit findings in the five cases where they were available, and distinguished sources that expose the basis of a determination from sources that leave it difficult or impossible to reconstruct. The read was not associated with appellate outcome, which indicates that reconstructability and substantive outcome are different properties of a decision.</w:t>
       </w:r>
     </w:p>
     <w:p>

</xml_diff>

<commit_message>
Third edit pass on SEC manuscript; finalise message to first author
Co-Authored-By: Claude Opus 5.5 <noreply@anthropic.com>
Claude-Session: https://claude.ai/code/session_01EwYX7947LH3EDG8rbKyfAp
</commit_message>
<xml_diff>
--- a/research/submissions/SEC_2026-10-21/Young_Wikes_SEC_manuscript.docx
+++ b/research/submissions/SEC_2026-10-21/Young_Wikes_SEC_manuscript.docx
@@ -405,7 +405,7 @@
           <w:rFonts w:ascii="Cambria" w:hAnsi="Cambria"/>
           <w:sz w:val="20"/>
         </w:rPr>
-        <w:t xml:space="preserve">This paper reports an empirical pilot of a structured record-level review designed to examine that property, which we call reconstructability: whether an independent reviewer can rebuild the basis for a consequential decision from the record alone. The review was applied to 32 publicly available public-records determinations, opinions and audits from two states. Three research questions guided the study:</w:t>
+        <w:t xml:space="preserve">This paper reports an empirical pilot of a structured record-level review designed to examine that property, referred to here as reconstructability: whether an independent reviewer can rebuild the basis for a consequential decision from the record alone. The review was applied to 32 publicly available public-records determinations, opinions and audits from two states. Three research questions guided the study:</w:t>
       </w:r>
     </w:p>
     <w:p>
@@ -734,7 +734,7 @@
           <w:rFonts w:ascii="Cambria" w:hAnsi="Cambria"/>
           <w:sz w:val="20"/>
         </w:rPr>
-        <w:t xml:space="preserve">Only public material was used. Each case was de-identified as to any private individual, and each case carries a public citation or source address. No internal, confidential, privileged or otherwise nonpublic government material was used.</w:t>
+        <w:t xml:space="preserve">Only public material was used. The case notes identify no private individual beyond what already appears in the public citation, and each case carries a public citation or source address. No internal, confidential, privileged or otherwise nonpublic government material was used.</w:t>
       </w:r>
     </w:p>
     <w:bookmarkEnd w:id="28"/>
@@ -2297,7 +2297,7 @@
           <w:rFonts w:ascii="Cambria" w:hAnsi="Cambria"/>
           <w:sz w:val="20"/>
         </w:rPr>
-        <w:t xml:space="preserve">The third is the governance of automated and AI-assisted administration. As drafting tools generate more of the text of administrative records, one risk is that records become well written without being reconstructable (Citron, 2008; Pasquale, 2015). Technology inventories of the kind announced by the Chief FOIA Officers Council answer what tools are in use. A documentation read answers whether the outputs hold up. The audit subset shows why both are needed: in all five audits, the failure recorded was evidentiary, an agency unable to show what it had done. That failure is invisible to an inventory of software and visible to a read of the record. Agencies could, alongside technology modernisation, sample their own determinations for reconstructability and so detect cases in which new tools produce well-written but unreconstructable records.</w:t>
+        <w:t xml:space="preserve">The third is the governance of automated and AI-assisted administration. As drafting tools generate more of the text of administrative records, one risk is that records become well written without being reconstructable (Citron, 2008; Pasquale, 2015). Technology inventories of the kind announced by the Chief FOIA Officers Council answer what tools are in use. A documentation read answers whether the outputs hold up. The audit subset illustrates why both may be needed: in all five audits, the failure recorded was evidentiary, an agency unable to show what it had done. That failure is invisible to an inventory of software and visible to a read of the record. Agencies could, alongside technology modernisation, sample their own determinations for reconstructability and so detect cases in which new tools produce well-written but unreconstructable records.</w:t>
       </w:r>
     </w:p>
     <w:bookmarkEnd w:id="51"/>

</xml_diff>